<commit_message>
chore: auto record Claude Code work
Changed files: work/_inbox/99_logs/instruction-log.md "work/washinokensetsu/03_documents/\346\245\255\347\225\214\347\240\224\347\251\266\344\274\232_\344\275\223\351\250\223\344\274\201\347\224\273\346\233\270.docx"
</commit_message>
<xml_diff>
--- a/work/washinokensetsu/03_documents/業界研究会_体験企画書.docx
+++ b/work/washinokensetsu/03_documents/業界研究会_体験企画書.docx
@@ -6,91 +6,43 @@
       <w:pPr>
         <w:pStyle w:val="1"/>
         <w:rPr>
-          <w:rFonts w:ascii="游ゴシック" w:eastAsia="游ゴシック" w:hAnsi="游ゴシック"/>
-        </w:rPr>
-      </w:pPr>
-      <w:r>
-        <w:rPr>
-          <w:rFonts w:ascii="游ゴシック" w:eastAsia="游ゴシック" w:hAnsi="游ゴシック" w:hint="eastAsia"/>
-        </w:rPr>
-        <w:t>業界研究会</w:t>
-      </w:r>
-      <w:r>
-        <w:rPr>
-          <w:rFonts w:ascii="游ゴシック" w:eastAsia="游ゴシック" w:hAnsi="游ゴシック" w:hint="eastAsia"/>
-        </w:rPr>
-        <w:t xml:space="preserve"> </w:t>
-      </w:r>
-      <w:r>
-        <w:rPr>
-          <w:rFonts w:ascii="游ゴシック" w:eastAsia="游ゴシック" w:hAnsi="游ゴシック" w:hint="eastAsia"/>
-        </w:rPr>
-        <w:t>体験企画書（わしの建設ブース）</w:t>
+          <w:rFonts w:ascii="Yu Gothic" w:eastAsia="Yu Gothic" w:hAnsi="Yu Gothic"/>
+        </w:rPr>
+      </w:pPr>
+      <w:r>
+        <w:rPr>
+          <w:rFonts w:ascii="Yu Gothic" w:eastAsia="Yu Gothic" w:hAnsi="Yu Gothic" w:hint="eastAsia"/>
+        </w:rPr>
+        <w:t>業界研究会 体験企画書（わしの建設ブース）</w:t>
       </w:r>
     </w:p>
     <w:p>
       <w:pPr>
-        <w:pStyle w:val="date"/>
+        <w:pStyle w:val="11"/>
         <w:spacing w:after="80"/>
         <w:rPr>
-          <w:rFonts w:ascii="游ゴシック" w:eastAsia="游ゴシック" w:hAnsi="游ゴシック" w:hint="eastAsia"/>
-        </w:rPr>
-      </w:pPr>
-      <w:r>
-        <w:rPr>
-          <w:rFonts w:ascii="游ゴシック" w:eastAsia="游ゴシック" w:hAnsi="游ゴシック" w:hint="eastAsia"/>
-        </w:rPr>
-        <w:t>2026</w:t>
-      </w:r>
-      <w:r>
-        <w:rPr>
-          <w:rFonts w:ascii="游ゴシック" w:eastAsia="游ゴシック" w:hAnsi="游ゴシック" w:hint="eastAsia"/>
-        </w:rPr>
-        <w:t>年</w:t>
-      </w:r>
-      <w:r>
-        <w:rPr>
-          <w:rFonts w:ascii="游ゴシック" w:eastAsia="游ゴシック" w:hAnsi="游ゴシック" w:hint="eastAsia"/>
-        </w:rPr>
-        <w:t>10</w:t>
-      </w:r>
-      <w:r>
-        <w:rPr>
-          <w:rFonts w:ascii="游ゴシック" w:eastAsia="游ゴシック" w:hAnsi="游ゴシック" w:hint="eastAsia"/>
-        </w:rPr>
-        <w:t>月</w:t>
-      </w:r>
-      <w:r>
-        <w:rPr>
-          <w:rFonts w:ascii="游ゴシック" w:eastAsia="游ゴシック" w:hAnsi="游ゴシック" w:hint="eastAsia"/>
-        </w:rPr>
-        <w:t>20</w:t>
-      </w:r>
-      <w:r>
-        <w:rPr>
-          <w:rFonts w:ascii="游ゴシック" w:eastAsia="游ゴシック" w:hAnsi="游ゴシック" w:hint="eastAsia"/>
-        </w:rPr>
-        <w:t>日　作成：小林</w:t>
+          <w:rFonts w:ascii="Yu Gothic" w:eastAsia="Yu Gothic" w:hAnsi="Yu Gothic"/>
+        </w:rPr>
+      </w:pPr>
+      <w:r>
+        <w:rPr>
+          <w:rFonts w:ascii="Yu Gothic" w:eastAsia="Yu Gothic" w:hAnsi="Yu Gothic" w:hint="eastAsia"/>
+        </w:rPr>
+        <w:t>2026年10月20日　作成：小林</w:t>
       </w:r>
     </w:p>
     <w:p>
       <w:pPr>
         <w:pStyle w:val="2"/>
         <w:rPr>
-          <w:rFonts w:ascii="游ゴシック" w:eastAsia="游ゴシック" w:hAnsi="游ゴシック" w:hint="eastAsia"/>
-        </w:rPr>
-      </w:pPr>
-      <w:r>
-        <w:rPr>
-          <w:rFonts w:ascii="游ゴシック" w:eastAsia="游ゴシック" w:hAnsi="游ゴシック" w:hint="eastAsia"/>
-        </w:rPr>
-        <w:t xml:space="preserve">1. </w:t>
-      </w:r>
-      <w:r>
-        <w:rPr>
-          <w:rFonts w:ascii="游ゴシック" w:eastAsia="游ゴシック" w:hAnsi="游ゴシック" w:hint="eastAsia"/>
-        </w:rPr>
-        <w:t>概要</w:t>
+          <w:rFonts w:ascii="Yu Gothic" w:eastAsia="Yu Gothic" w:hAnsi="Yu Gothic"/>
+        </w:rPr>
+      </w:pPr>
+      <w:r>
+        <w:rPr>
+          <w:rFonts w:ascii="Yu Gothic" w:eastAsia="Yu Gothic" w:hAnsi="Yu Gothic" w:hint="eastAsia"/>
+        </w:rPr>
+        <w:t>1. 概要</w:t>
       </w:r>
     </w:p>
     <w:tbl>
@@ -130,7 +82,7 @@
           <w:p>
             <w:pPr>
               <w:rPr>
-                <w:rFonts w:ascii="游ゴシック" w:eastAsia="游ゴシック" w:hAnsi="游ゴシック" w:hint="eastAsia"/>
+                <w:rFonts w:ascii="Yu Gothic" w:eastAsia="Yu Gothic" w:hAnsi="Yu Gothic"/>
                 <w:b/>
                 <w:bCs/>
                 <w:sz w:val="20"/>
@@ -139,7 +91,7 @@
             </w:pPr>
             <w:r>
               <w:rPr>
-                <w:rFonts w:ascii="游ゴシック" w:eastAsia="游ゴシック" w:hAnsi="游ゴシック" w:hint="eastAsia"/>
+                <w:rFonts w:ascii="Yu Gothic" w:eastAsia="Yu Gothic" w:hAnsi="Yu Gothic" w:hint="eastAsia"/>
                 <w:b/>
                 <w:bCs/>
                 <w:sz w:val="20"/>
@@ -170,7 +122,7 @@
           <w:p>
             <w:pPr>
               <w:rPr>
-                <w:rFonts w:ascii="游ゴシック" w:eastAsia="游ゴシック" w:hAnsi="游ゴシック" w:hint="eastAsia"/>
+                <w:rFonts w:ascii="Yu Gothic" w:eastAsia="Yu Gothic" w:hAnsi="Yu Gothic"/>
                 <w:b/>
                 <w:bCs/>
                 <w:sz w:val="20"/>
@@ -179,7 +131,7 @@
             </w:pPr>
             <w:r>
               <w:rPr>
-                <w:rFonts w:ascii="游ゴシック" w:eastAsia="游ゴシック" w:hAnsi="游ゴシック" w:hint="eastAsia"/>
+                <w:rFonts w:ascii="Yu Gothic" w:eastAsia="Yu Gothic" w:hAnsi="Yu Gothic" w:hint="eastAsia"/>
                 <w:b/>
                 <w:bCs/>
                 <w:sz w:val="20"/>
@@ -211,14 +163,14 @@
           <w:p>
             <w:pPr>
               <w:rPr>
-                <w:rFonts w:ascii="游ゴシック" w:eastAsia="游ゴシック" w:hAnsi="游ゴシック" w:hint="eastAsia"/>
+                <w:rFonts w:ascii="Yu Gothic" w:eastAsia="Yu Gothic" w:hAnsi="Yu Gothic"/>
                 <w:sz w:val="20"/>
                 <w:szCs w:val="20"/>
               </w:rPr>
             </w:pPr>
             <w:r>
               <w:rPr>
-                <w:rFonts w:ascii="游ゴシック" w:eastAsia="游ゴシック" w:hAnsi="游ゴシック" w:hint="eastAsia"/>
+                <w:rFonts w:ascii="Yu Gothic" w:eastAsia="Yu Gothic" w:hAnsi="Yu Gothic" w:hint="eastAsia"/>
                 <w:sz w:val="20"/>
                 <w:szCs w:val="20"/>
               </w:rPr>
@@ -246,34 +198,18 @@
           <w:p>
             <w:pPr>
               <w:rPr>
-                <w:rFonts w:ascii="游ゴシック" w:eastAsia="游ゴシック" w:hAnsi="游ゴシック" w:hint="eastAsia"/>
+                <w:rFonts w:ascii="Yu Gothic" w:eastAsia="Yu Gothic" w:hAnsi="Yu Gothic"/>
                 <w:sz w:val="20"/>
                 <w:szCs w:val="20"/>
               </w:rPr>
             </w:pPr>
             <w:r>
               <w:rPr>
-                <w:rFonts w:ascii="游ゴシック" w:eastAsia="游ゴシック" w:hAnsi="游ゴシック" w:hint="eastAsia"/>
-                <w:sz w:val="20"/>
-                <w:szCs w:val="20"/>
-              </w:rPr>
-              <w:t>業界研究会（同友会主催・会場</w:t>
-            </w:r>
-            <w:r>
-              <w:rPr>
-                <w:rFonts w:ascii="游ゴシック" w:eastAsia="游ゴシック" w:hAnsi="游ゴシック" w:hint="eastAsia"/>
-                <w:sz w:val="20"/>
-                <w:szCs w:val="20"/>
-              </w:rPr>
-              <w:t xml:space="preserve"> FabCafe</w:t>
-            </w:r>
-            <w:r>
-              <w:rPr>
-                <w:rFonts w:ascii="游ゴシック" w:eastAsia="游ゴシック" w:hAnsi="游ゴシック" w:hint="eastAsia"/>
-                <w:sz w:val="20"/>
-                <w:szCs w:val="20"/>
-              </w:rPr>
-              <w:t>）</w:t>
+                <w:rFonts w:ascii="Yu Gothic" w:eastAsia="Yu Gothic" w:hAnsi="Yu Gothic" w:hint="eastAsia"/>
+                <w:sz w:val="20"/>
+                <w:szCs w:val="20"/>
+              </w:rPr>
+              <w:t>業界研究会（同友会主催・会場 FabCafe）</w:t>
             </w:r>
           </w:p>
         </w:tc>
@@ -299,14 +235,14 @@
           <w:p>
             <w:pPr>
               <w:rPr>
-                <w:rFonts w:ascii="游ゴシック" w:eastAsia="游ゴシック" w:hAnsi="游ゴシック" w:hint="eastAsia"/>
+                <w:rFonts w:ascii="Yu Gothic" w:eastAsia="Yu Gothic" w:hAnsi="Yu Gothic"/>
                 <w:sz w:val="20"/>
                 <w:szCs w:val="20"/>
               </w:rPr>
             </w:pPr>
             <w:r>
               <w:rPr>
-                <w:rFonts w:ascii="游ゴシック" w:eastAsia="游ゴシック" w:hAnsi="游ゴシック" w:hint="eastAsia"/>
+                <w:rFonts w:ascii="Yu Gothic" w:eastAsia="Yu Gothic" w:hAnsi="Yu Gothic" w:hint="eastAsia"/>
                 <w:sz w:val="20"/>
                 <w:szCs w:val="20"/>
               </w:rPr>
@@ -334,50 +270,18 @@
           <w:p>
             <w:pPr>
               <w:rPr>
-                <w:rFonts w:ascii="游ゴシック" w:eastAsia="游ゴシック" w:hAnsi="游ゴシック" w:hint="eastAsia"/>
+                <w:rFonts w:ascii="Yu Gothic" w:eastAsia="Yu Gothic" w:hAnsi="Yu Gothic"/>
                 <w:sz w:val="20"/>
                 <w:szCs w:val="20"/>
               </w:rPr>
             </w:pPr>
             <w:r>
               <w:rPr>
-                <w:rFonts w:ascii="游ゴシック" w:eastAsia="游ゴシック" w:hAnsi="游ゴシック" w:hint="eastAsia"/>
-                <w:sz w:val="20"/>
-                <w:szCs w:val="20"/>
-              </w:rPr>
-              <w:t>大学</w:t>
-            </w:r>
-            <w:r>
-              <w:rPr>
-                <w:rFonts w:ascii="游ゴシック" w:eastAsia="游ゴシック" w:hAnsi="游ゴシック" w:hint="eastAsia"/>
-                <w:sz w:val="20"/>
-                <w:szCs w:val="20"/>
-              </w:rPr>
-              <w:t>1</w:t>
-            </w:r>
-            <w:r>
-              <w:rPr>
-                <w:rFonts w:ascii="游ゴシック" w:eastAsia="游ゴシック" w:hAnsi="游ゴシック" w:hint="eastAsia"/>
-                <w:sz w:val="20"/>
-                <w:szCs w:val="20"/>
-              </w:rPr>
-              <w:t>〜</w:t>
-            </w:r>
-            <w:r>
-              <w:rPr>
-                <w:rFonts w:ascii="游ゴシック" w:eastAsia="游ゴシック" w:hAnsi="游ゴシック" w:hint="eastAsia"/>
-                <w:sz w:val="20"/>
-                <w:szCs w:val="20"/>
-              </w:rPr>
-              <w:t>3</w:t>
-            </w:r>
-            <w:r>
-              <w:rPr>
-                <w:rFonts w:ascii="游ゴシック" w:eastAsia="游ゴシック" w:hAnsi="游ゴシック" w:hint="eastAsia"/>
-                <w:sz w:val="20"/>
-                <w:szCs w:val="20"/>
-              </w:rPr>
-              <w:t>年生</w:t>
+                <w:rFonts w:ascii="Yu Gothic" w:eastAsia="Yu Gothic" w:hAnsi="Yu Gothic" w:hint="eastAsia"/>
+                <w:sz w:val="20"/>
+                <w:szCs w:val="20"/>
+              </w:rPr>
+              <w:t>大学1〜3年生</w:t>
             </w:r>
           </w:p>
         </w:tc>
@@ -403,14 +307,14 @@
           <w:p>
             <w:pPr>
               <w:rPr>
-                <w:rFonts w:ascii="游ゴシック" w:eastAsia="游ゴシック" w:hAnsi="游ゴシック" w:hint="eastAsia"/>
+                <w:rFonts w:ascii="Yu Gothic" w:eastAsia="Yu Gothic" w:hAnsi="Yu Gothic"/>
                 <w:sz w:val="20"/>
                 <w:szCs w:val="20"/>
               </w:rPr>
             </w:pPr>
             <w:r>
               <w:rPr>
-                <w:rFonts w:ascii="游ゴシック" w:eastAsia="游ゴシック" w:hAnsi="游ゴシック" w:hint="eastAsia"/>
+                <w:rFonts w:ascii="Yu Gothic" w:eastAsia="Yu Gothic" w:hAnsi="Yu Gothic" w:hint="eastAsia"/>
                 <w:sz w:val="20"/>
                 <w:szCs w:val="20"/>
               </w:rPr>
@@ -438,50 +342,18 @@
           <w:p>
             <w:pPr>
               <w:rPr>
-                <w:rFonts w:ascii="游ゴシック" w:eastAsia="游ゴシック" w:hAnsi="游ゴシック" w:hint="eastAsia"/>
+                <w:rFonts w:ascii="Yu Gothic" w:eastAsia="Yu Gothic" w:hAnsi="Yu Gothic"/>
                 <w:sz w:val="20"/>
                 <w:szCs w:val="20"/>
               </w:rPr>
             </w:pPr>
             <w:r>
               <w:rPr>
-                <w:rFonts w:ascii="游ゴシック" w:eastAsia="游ゴシック" w:hAnsi="游ゴシック" w:hint="eastAsia"/>
-                <w:sz w:val="20"/>
-                <w:szCs w:val="20"/>
-              </w:rPr>
-              <w:t>ブース形式。</w:t>
-            </w:r>
-            <w:r>
-              <w:rPr>
-                <w:rFonts w:ascii="游ゴシック" w:eastAsia="游ゴシック" w:hAnsi="游ゴシック" w:hint="eastAsia"/>
-                <w:sz w:val="20"/>
-                <w:szCs w:val="20"/>
-              </w:rPr>
-              <w:t>1</w:t>
-            </w:r>
-            <w:r>
-              <w:rPr>
-                <w:rFonts w:ascii="游ゴシック" w:eastAsia="游ゴシック" w:hAnsi="游ゴシック" w:hint="eastAsia"/>
-                <w:sz w:val="20"/>
-                <w:szCs w:val="20"/>
-              </w:rPr>
-              <w:t>組</w:t>
-            </w:r>
-            <w:r>
-              <w:rPr>
-                <w:rFonts w:ascii="游ゴシック" w:eastAsia="游ゴシック" w:hAnsi="游ゴシック" w:hint="eastAsia"/>
-                <w:sz w:val="20"/>
-                <w:szCs w:val="20"/>
-              </w:rPr>
-              <w:t>3</w:t>
-            </w:r>
-            <w:r>
-              <w:rPr>
-                <w:rFonts w:ascii="游ゴシック" w:eastAsia="游ゴシック" w:hAnsi="游ゴシック" w:hint="eastAsia"/>
-                <w:sz w:val="20"/>
-                <w:szCs w:val="20"/>
-              </w:rPr>
-              <w:t>人程度ずつ対応</w:t>
+                <w:rFonts w:ascii="Yu Gothic" w:eastAsia="Yu Gothic" w:hAnsi="Yu Gothic" w:hint="eastAsia"/>
+                <w:sz w:val="20"/>
+                <w:szCs w:val="20"/>
+              </w:rPr>
+              <w:t>ブース形式。1組3人程度ずつ対応</w:t>
             </w:r>
           </w:p>
         </w:tc>
@@ -507,26 +379,18 @@
           <w:p>
             <w:pPr>
               <w:rPr>
-                <w:rFonts w:ascii="游ゴシック" w:eastAsia="游ゴシック" w:hAnsi="游ゴシック" w:hint="eastAsia"/>
+                <w:rFonts w:ascii="Yu Gothic" w:eastAsia="Yu Gothic" w:hAnsi="Yu Gothic"/>
                 <w:sz w:val="20"/>
                 <w:szCs w:val="20"/>
               </w:rPr>
             </w:pPr>
             <w:r>
               <w:rPr>
-                <w:rFonts w:ascii="游ゴシック" w:eastAsia="游ゴシック" w:hAnsi="游ゴシック" w:hint="eastAsia"/>
-                <w:sz w:val="20"/>
-                <w:szCs w:val="20"/>
-              </w:rPr>
-              <w:t>1</w:t>
-            </w:r>
-            <w:r>
-              <w:rPr>
-                <w:rFonts w:ascii="游ゴシック" w:eastAsia="游ゴシック" w:hAnsi="游ゴシック" w:hint="eastAsia"/>
-                <w:sz w:val="20"/>
-                <w:szCs w:val="20"/>
-              </w:rPr>
-              <w:t>回の時間</w:t>
+                <w:rFonts w:ascii="Yu Gothic" w:eastAsia="Yu Gothic" w:hAnsi="Yu Gothic" w:hint="eastAsia"/>
+                <w:sz w:val="20"/>
+                <w:szCs w:val="20"/>
+              </w:rPr>
+              <w:t>1回の時間</w:t>
             </w:r>
           </w:p>
         </w:tc>
@@ -550,82 +414,18 @@
           <w:p>
             <w:pPr>
               <w:rPr>
-                <w:rFonts w:ascii="游ゴシック" w:eastAsia="游ゴシック" w:hAnsi="游ゴシック" w:hint="eastAsia"/>
+                <w:rFonts w:ascii="Yu Gothic" w:eastAsia="Yu Gothic" w:hAnsi="Yu Gothic"/>
                 <w:sz w:val="20"/>
                 <w:szCs w:val="20"/>
               </w:rPr>
             </w:pPr>
             <w:r>
               <w:rPr>
-                <w:rFonts w:ascii="游ゴシック" w:eastAsia="游ゴシック" w:hAnsi="游ゴシック" w:hint="eastAsia"/>
-                <w:sz w:val="20"/>
-                <w:szCs w:val="20"/>
-              </w:rPr>
-              <w:t>約</w:t>
-            </w:r>
-            <w:r>
-              <w:rPr>
-                <w:rFonts w:ascii="游ゴシック" w:eastAsia="游ゴシック" w:hAnsi="游ゴシック" w:hint="eastAsia"/>
-                <w:sz w:val="20"/>
-                <w:szCs w:val="20"/>
-              </w:rPr>
-              <w:t>20</w:t>
-            </w:r>
-            <w:r>
-              <w:rPr>
-                <w:rFonts w:ascii="游ゴシック" w:eastAsia="游ゴシック" w:hAnsi="游ゴシック" w:hint="eastAsia"/>
-                <w:sz w:val="20"/>
-                <w:szCs w:val="20"/>
-              </w:rPr>
-              <w:t>分（会社説明</w:t>
-            </w:r>
-            <w:r>
-              <w:rPr>
-                <w:rFonts w:ascii="游ゴシック" w:eastAsia="游ゴシック" w:hAnsi="游ゴシック" w:hint="eastAsia"/>
-                <w:sz w:val="20"/>
-                <w:szCs w:val="20"/>
-              </w:rPr>
-              <w:t>5</w:t>
-            </w:r>
-            <w:r>
-              <w:rPr>
-                <w:rFonts w:ascii="游ゴシック" w:eastAsia="游ゴシック" w:hAnsi="游ゴシック" w:hint="eastAsia"/>
-                <w:sz w:val="20"/>
-                <w:szCs w:val="20"/>
-              </w:rPr>
-              <w:t>分／体験</w:t>
-            </w:r>
-            <w:r>
-              <w:rPr>
-                <w:rFonts w:ascii="游ゴシック" w:eastAsia="游ゴシック" w:hAnsi="游ゴシック" w:hint="eastAsia"/>
-                <w:sz w:val="20"/>
-                <w:szCs w:val="20"/>
-              </w:rPr>
-              <w:t>10</w:t>
-            </w:r>
-            <w:r>
-              <w:rPr>
-                <w:rFonts w:ascii="游ゴシック" w:eastAsia="游ゴシック" w:hAnsi="游ゴシック" w:hint="eastAsia"/>
-                <w:sz w:val="20"/>
-                <w:szCs w:val="20"/>
-              </w:rPr>
-              <w:t>分／会社訪問・インターン案内</w:t>
-            </w:r>
-            <w:r>
-              <w:rPr>
-                <w:rFonts w:ascii="游ゴシック" w:eastAsia="游ゴシック" w:hAnsi="游ゴシック" w:hint="eastAsia"/>
-                <w:sz w:val="20"/>
-                <w:szCs w:val="20"/>
-              </w:rPr>
-              <w:t>5</w:t>
-            </w:r>
-            <w:r>
-              <w:rPr>
-                <w:rFonts w:ascii="游ゴシック" w:eastAsia="游ゴシック" w:hAnsi="游ゴシック" w:hint="eastAsia"/>
-                <w:sz w:val="20"/>
-                <w:szCs w:val="20"/>
-              </w:rPr>
-              <w:t>分）</w:t>
+                <w:rFonts w:ascii="Yu Gothic" w:eastAsia="Yu Gothic" w:hAnsi="Yu Gothic" w:hint="eastAsia"/>
+                <w:sz w:val="20"/>
+                <w:szCs w:val="20"/>
+              </w:rPr>
+              <w:t>約20分（会社説明5分／体験10分／会社訪問・インターン案内5分）</w:t>
             </w:r>
           </w:p>
         </w:tc>
@@ -635,80 +435,46 @@
       <w:pPr>
         <w:pStyle w:val="2"/>
         <w:rPr>
-          <w:rFonts w:ascii="游ゴシック" w:eastAsia="游ゴシック" w:hAnsi="游ゴシック" w:hint="eastAsia"/>
-        </w:rPr>
-      </w:pPr>
-      <w:r>
-        <w:rPr>
-          <w:rFonts w:ascii="游ゴシック" w:eastAsia="游ゴシック" w:hAnsi="游ゴシック" w:hint="eastAsia"/>
-        </w:rPr>
-        <w:t xml:space="preserve">2. </w:t>
-      </w:r>
-      <w:r>
-        <w:rPr>
-          <w:rFonts w:ascii="游ゴシック" w:eastAsia="游ゴシック" w:hAnsi="游ゴシック" w:hint="eastAsia"/>
-        </w:rPr>
-        <w:t>企画名</w:t>
+          <w:rFonts w:ascii="Yu Gothic" w:eastAsia="Yu Gothic" w:hAnsi="Yu Gothic"/>
+        </w:rPr>
+      </w:pPr>
+      <w:r>
+        <w:rPr>
+          <w:rFonts w:ascii="Yu Gothic" w:eastAsia="Yu Gothic" w:hAnsi="Yu Gothic" w:hint="eastAsia"/>
+        </w:rPr>
+        <w:t>2. 企画名</w:t>
       </w:r>
     </w:p>
     <w:p>
       <w:pPr>
-        <w:pStyle w:val="title"/>
-        <w:rPr>
-          <w:rFonts w:ascii="游ゴシック" w:eastAsia="游ゴシック" w:hAnsi="游ゴシック" w:hint="eastAsia"/>
-        </w:rPr>
-      </w:pPr>
-      <w:r>
-        <w:rPr>
-          <w:rFonts w:ascii="游ゴシック" w:eastAsia="游ゴシック" w:hAnsi="游ゴシック" w:hint="eastAsia"/>
-        </w:rPr>
-        <w:t>「わしの建設に、</w:t>
-      </w:r>
-      <w:r>
-        <w:rPr>
-          <w:rFonts w:ascii="游ゴシック" w:eastAsia="游ゴシック" w:hAnsi="游ゴシック" w:hint="eastAsia"/>
-        </w:rPr>
-        <w:t>1</w:t>
-      </w:r>
-      <w:r>
-        <w:rPr>
-          <w:rFonts w:ascii="游ゴシック" w:eastAsia="游ゴシック" w:hAnsi="游ゴシック" w:hint="eastAsia"/>
-        </w:rPr>
-        <w:t>つ提案してください」</w:t>
+        <w:pStyle w:val="12"/>
+        <w:rPr>
+          <w:rFonts w:ascii="Yu Gothic" w:eastAsia="Yu Gothic" w:hAnsi="Yu Gothic"/>
+        </w:rPr>
+      </w:pPr>
+      <w:r>
+        <w:rPr>
+          <w:rFonts w:ascii="Yu Gothic" w:eastAsia="Yu Gothic" w:hAnsi="Yu Gothic" w:hint="eastAsia"/>
+        </w:rPr>
+        <w:t>「わしの建設に、1つ提案してください」</w:t>
       </w:r>
     </w:p>
     <w:p>
       <w:pPr>
         <w:pStyle w:val="Web"/>
         <w:rPr>
-          <w:rFonts w:ascii="游ゴシック" w:eastAsia="游ゴシック" w:hAnsi="游ゴシック" w:hint="eastAsia"/>
-          <w:sz w:val="21"/>
-          <w:szCs w:val="21"/>
-        </w:rPr>
-      </w:pPr>
-      <w:r>
-        <w:rPr>
-          <w:rFonts w:ascii="游ゴシック" w:eastAsia="游ゴシック" w:hAnsi="游ゴシック" w:hint="eastAsia"/>
-          <w:sz w:val="21"/>
-          <w:szCs w:val="21"/>
-        </w:rPr>
-        <w:t>社長案の</w:t>
-      </w:r>
-      <w:r>
-        <w:rPr>
-          <w:rFonts w:ascii="游ゴシック" w:eastAsia="游ゴシック" w:hAnsi="游ゴシック" w:hint="eastAsia"/>
-          <w:sz w:val="21"/>
-          <w:szCs w:val="21"/>
-        </w:rPr>
-        <w:t>2</w:t>
-      </w:r>
-      <w:r>
-        <w:rPr>
-          <w:rFonts w:ascii="游ゴシック" w:eastAsia="游ゴシック" w:hAnsi="游ゴシック" w:hint="eastAsia"/>
-          <w:sz w:val="21"/>
-          <w:szCs w:val="21"/>
-        </w:rPr>
-        <w:t>つの問いを、学生が自分の経験から答えられる形にして聞く。</w:t>
+          <w:rFonts w:ascii="Yu Gothic" w:eastAsia="Yu Gothic" w:hAnsi="Yu Gothic"/>
+          <w:sz w:val="21"/>
+          <w:szCs w:val="21"/>
+        </w:rPr>
+      </w:pPr>
+      <w:r>
+        <w:rPr>
+          <w:rFonts w:ascii="Yu Gothic" w:eastAsia="Yu Gothic" w:hAnsi="Yu Gothic" w:hint="eastAsia"/>
+          <w:sz w:val="21"/>
+          <w:szCs w:val="21"/>
+        </w:rPr>
+        <w:t>社長案の2つの問いを、学生が自分の経験から答えられる形にして聞く。</w:t>
       </w:r>
     </w:p>
     <w:p>
@@ -719,46 +485,30 @@
         </w:numPr>
         <w:spacing w:after="40"/>
         <w:rPr>
-          <w:rFonts w:ascii="游ゴシック" w:eastAsia="游ゴシック" w:hAnsi="游ゴシック" w:hint="eastAsia"/>
-          <w:sz w:val="21"/>
-          <w:szCs w:val="21"/>
-        </w:rPr>
-      </w:pPr>
-      <w:r>
-        <w:rPr>
-          <w:rFonts w:ascii="游ゴシック" w:eastAsia="游ゴシック" w:hAnsi="游ゴシック" w:hint="eastAsia"/>
-          <w:sz w:val="21"/>
-          <w:szCs w:val="21"/>
-        </w:rPr>
-        <w:t>①</w:t>
-      </w:r>
-      <w:r>
-        <w:rPr>
-          <w:rFonts w:ascii="游ゴシック" w:eastAsia="游ゴシック" w:hAnsi="游ゴシック" w:hint="eastAsia"/>
-          <w:sz w:val="21"/>
-          <w:szCs w:val="21"/>
-        </w:rPr>
-        <w:t xml:space="preserve"> </w:t>
-      </w:r>
-      <w:r>
-        <w:rPr>
-          <w:rFonts w:ascii="游ゴシック" w:eastAsia="游ゴシック" w:hAnsi="游ゴシック" w:hint="eastAsia"/>
-          <w:sz w:val="21"/>
-          <w:szCs w:val="21"/>
-        </w:rPr>
-        <w:t>頼みたくなる会社の特長</w:t>
-      </w:r>
-      <w:r>
-        <w:rPr>
-          <w:rFonts w:ascii="游ゴシック" w:eastAsia="游ゴシック" w:hAnsi="游ゴシック" w:hint="eastAsia"/>
-          <w:sz w:val="21"/>
-          <w:szCs w:val="21"/>
-        </w:rPr>
-        <w:t xml:space="preserve"> </w:t>
-      </w:r>
-      <w:r>
-        <w:rPr>
-          <w:rFonts w:ascii="游ゴシック" w:eastAsia="游ゴシック" w:hAnsi="游ゴシック" w:hint="eastAsia"/>
+          <w:rFonts w:ascii="Yu Gothic" w:eastAsia="Yu Gothic" w:hAnsi="Yu Gothic"/>
+          <w:sz w:val="21"/>
+          <w:szCs w:val="21"/>
+        </w:rPr>
+      </w:pPr>
+      <w:r>
+        <w:rPr>
+          <w:rFonts w:ascii="Yu Gothic" w:eastAsia="Yu Gothic" w:hAnsi="Yu Gothic" w:hint="eastAsia"/>
+          <w:sz w:val="21"/>
+          <w:szCs w:val="21"/>
+        </w:rPr>
+        <w:t>① 頼みたくなる会社の</w:t>
+      </w:r>
+      <w:r>
+        <w:rPr>
+          <w:rFonts w:ascii="Yu Gothic" w:eastAsia="Yu Gothic" w:hAnsi="Yu Gothic" w:hint="eastAsia"/>
+          <w:sz w:val="21"/>
+          <w:szCs w:val="21"/>
+        </w:rPr>
+        <w:t>特徴</w:t>
+      </w:r>
+      <w:r>
+        <w:rPr>
+          <w:rFonts w:ascii="Yu Gothic" w:eastAsia="Yu Gothic" w:hAnsi="Yu Gothic" w:hint="eastAsia"/>
           <w:sz w:val="21"/>
           <w:szCs w:val="21"/>
         </w:rPr>
@@ -773,70 +523,32 @@
         </w:numPr>
         <w:spacing w:after="40"/>
         <w:rPr>
-          <w:rFonts w:ascii="游ゴシック" w:eastAsia="游ゴシック" w:hAnsi="游ゴシック" w:hint="eastAsia"/>
-          <w:sz w:val="21"/>
-          <w:szCs w:val="21"/>
-        </w:rPr>
-      </w:pPr>
-      <w:r>
-        <w:rPr>
-          <w:rFonts w:ascii="游ゴシック" w:eastAsia="游ゴシック" w:hAnsi="游ゴシック" w:hint="eastAsia"/>
-          <w:sz w:val="21"/>
-          <w:szCs w:val="21"/>
-        </w:rPr>
-        <w:t>②</w:t>
-      </w:r>
-      <w:r>
-        <w:rPr>
-          <w:rFonts w:ascii="游ゴシック" w:eastAsia="游ゴシック" w:hAnsi="游ゴシック" w:hint="eastAsia"/>
-          <w:sz w:val="21"/>
-          <w:szCs w:val="21"/>
-        </w:rPr>
-        <w:t xml:space="preserve"> </w:t>
-      </w:r>
-      <w:r>
-        <w:rPr>
-          <w:rFonts w:ascii="游ゴシック" w:eastAsia="游ゴシック" w:hAnsi="游ゴシック" w:hint="eastAsia"/>
-          <w:sz w:val="21"/>
-          <w:szCs w:val="21"/>
-        </w:rPr>
-        <w:t>どんな時に建物を改造するか</w:t>
-      </w:r>
-      <w:r>
-        <w:rPr>
-          <w:rFonts w:ascii="游ゴシック" w:eastAsia="游ゴシック" w:hAnsi="游ゴシック" w:hint="eastAsia"/>
-          <w:sz w:val="21"/>
-          <w:szCs w:val="21"/>
-        </w:rPr>
-        <w:t xml:space="preserve"> </w:t>
-      </w:r>
-      <w:r>
-        <w:rPr>
-          <w:rFonts w:ascii="游ゴシック" w:eastAsia="游ゴシック" w:hAnsi="游ゴシック" w:hint="eastAsia"/>
-          <w:sz w:val="21"/>
-          <w:szCs w:val="21"/>
-        </w:rPr>
-        <w:t>→「通っている学校やバイト先で、困っているところ・改造してほしいところは？」</w:t>
+          <w:rFonts w:ascii="Yu Gothic" w:eastAsia="Yu Gothic" w:hAnsi="Yu Gothic"/>
+          <w:sz w:val="21"/>
+          <w:szCs w:val="21"/>
+        </w:rPr>
+      </w:pPr>
+      <w:r>
+        <w:rPr>
+          <w:rFonts w:ascii="Yu Gothic" w:eastAsia="Yu Gothic" w:hAnsi="Yu Gothic" w:hint="eastAsia"/>
+          <w:sz w:val="21"/>
+          <w:szCs w:val="21"/>
+        </w:rPr>
+        <w:t>② どんな時に建物を改造するか →「通っている学校やバイト先で、困っているところ・改造してほしいところは？」</w:t>
       </w:r>
     </w:p>
     <w:p>
       <w:pPr>
         <w:pStyle w:val="2"/>
         <w:rPr>
-          <w:rFonts w:ascii="游ゴシック" w:eastAsia="游ゴシック" w:hAnsi="游ゴシック" w:hint="eastAsia"/>
-        </w:rPr>
-      </w:pPr>
-      <w:r>
-        <w:rPr>
-          <w:rFonts w:ascii="游ゴシック" w:eastAsia="游ゴシック" w:hAnsi="游ゴシック" w:hint="eastAsia"/>
-        </w:rPr>
-        <w:t xml:space="preserve">3. </w:t>
-      </w:r>
-      <w:r>
-        <w:rPr>
-          <w:rFonts w:ascii="游ゴシック" w:eastAsia="游ゴシック" w:hAnsi="游ゴシック" w:hint="eastAsia"/>
-        </w:rPr>
-        <w:t>ねらい</w:t>
+          <w:rFonts w:ascii="Yu Gothic" w:eastAsia="Yu Gothic" w:hAnsi="Yu Gothic"/>
+        </w:rPr>
+      </w:pPr>
+      <w:r>
+        <w:rPr>
+          <w:rFonts w:ascii="Yu Gothic" w:eastAsia="Yu Gothic" w:hAnsi="Yu Gothic" w:hint="eastAsia"/>
+        </w:rPr>
+        <w:t>3. ねらい</w:t>
       </w:r>
     </w:p>
     <w:p>
@@ -847,14 +559,14 @@
         </w:numPr>
         <w:spacing w:after="40"/>
         <w:rPr>
-          <w:rFonts w:ascii="游ゴシック" w:eastAsia="游ゴシック" w:hAnsi="游ゴシック" w:hint="eastAsia"/>
-          <w:sz w:val="21"/>
-          <w:szCs w:val="21"/>
-        </w:rPr>
-      </w:pPr>
-      <w:r>
-        <w:rPr>
-          <w:rFonts w:ascii="游ゴシック" w:eastAsia="游ゴシック" w:hAnsi="游ゴシック" w:hint="eastAsia"/>
+          <w:rFonts w:ascii="Yu Gothic" w:eastAsia="Yu Gothic" w:hAnsi="Yu Gothic"/>
+          <w:sz w:val="21"/>
+          <w:szCs w:val="21"/>
+        </w:rPr>
+      </w:pPr>
+      <w:r>
+        <w:rPr>
+          <w:rFonts w:ascii="Yu Gothic" w:eastAsia="Yu Gothic" w:hAnsi="Yu Gothic" w:hint="eastAsia"/>
           <w:b/>
           <w:bCs/>
           <w:sz w:val="21"/>
@@ -864,7 +576,7 @@
       </w:r>
       <w:r>
         <w:rPr>
-          <w:rFonts w:ascii="游ゴシック" w:eastAsia="游ゴシック" w:hAnsi="游ゴシック" w:hint="eastAsia"/>
+          <w:rFonts w:ascii="Yu Gothic" w:eastAsia="Yu Gothic" w:hAnsi="Yu Gothic" w:hint="eastAsia"/>
           <w:sz w:val="21"/>
           <w:szCs w:val="21"/>
         </w:rPr>
@@ -879,14 +591,14 @@
         </w:numPr>
         <w:spacing w:after="40"/>
         <w:rPr>
-          <w:rFonts w:ascii="游ゴシック" w:eastAsia="游ゴシック" w:hAnsi="游ゴシック" w:hint="eastAsia"/>
-          <w:sz w:val="21"/>
-          <w:szCs w:val="21"/>
-        </w:rPr>
-      </w:pPr>
-      <w:r>
-        <w:rPr>
-          <w:rFonts w:ascii="游ゴシック" w:eastAsia="游ゴシック" w:hAnsi="游ゴシック" w:hint="eastAsia"/>
+          <w:rFonts w:ascii="Yu Gothic" w:eastAsia="Yu Gothic" w:hAnsi="Yu Gothic"/>
+          <w:sz w:val="21"/>
+          <w:szCs w:val="21"/>
+        </w:rPr>
+      </w:pPr>
+      <w:r>
+        <w:rPr>
+          <w:rFonts w:ascii="Yu Gothic" w:eastAsia="Yu Gothic" w:hAnsi="Yu Gothic" w:hint="eastAsia"/>
           <w:b/>
           <w:bCs/>
           <w:sz w:val="21"/>
@@ -896,7 +608,7 @@
       </w:r>
       <w:r>
         <w:rPr>
-          <w:rFonts w:ascii="游ゴシック" w:eastAsia="游ゴシック" w:hAnsi="游ゴシック" w:hint="eastAsia"/>
+          <w:rFonts w:ascii="Yu Gothic" w:eastAsia="Yu Gothic" w:hAnsi="Yu Gothic" w:hint="eastAsia"/>
           <w:sz w:val="21"/>
           <w:szCs w:val="21"/>
         </w:rPr>
@@ -911,14 +623,14 @@
         </w:numPr>
         <w:spacing w:after="40"/>
         <w:rPr>
-          <w:rFonts w:ascii="游ゴシック" w:eastAsia="游ゴシック" w:hAnsi="游ゴシック" w:hint="eastAsia"/>
-          <w:sz w:val="21"/>
-          <w:szCs w:val="21"/>
-        </w:rPr>
-      </w:pPr>
-      <w:r>
-        <w:rPr>
-          <w:rFonts w:ascii="游ゴシック" w:eastAsia="游ゴシック" w:hAnsi="游ゴシック" w:hint="eastAsia"/>
+          <w:rFonts w:ascii="Yu Gothic" w:eastAsia="Yu Gothic" w:hAnsi="Yu Gothic"/>
+          <w:sz w:val="21"/>
+          <w:szCs w:val="21"/>
+        </w:rPr>
+      </w:pPr>
+      <w:r>
+        <w:rPr>
+          <w:rFonts w:ascii="Yu Gothic" w:eastAsia="Yu Gothic" w:hAnsi="Yu Gothic" w:hint="eastAsia"/>
           <w:b/>
           <w:bCs/>
           <w:sz w:val="21"/>
@@ -928,43 +640,41 @@
       </w:r>
       <w:r>
         <w:rPr>
-          <w:rFonts w:ascii="游ゴシック" w:eastAsia="游ゴシック" w:hAnsi="游ゴシック" w:hint="eastAsia"/>
-          <w:sz w:val="21"/>
-          <w:szCs w:val="21"/>
-        </w:rPr>
-        <w:t>：「提案がどうなったかは会社訪問で」と伝え、訪問のきっかけをつくる</w:t>
+          <w:rFonts w:ascii="Yu Gothic" w:eastAsia="Yu Gothic" w:hAnsi="Yu Gothic" w:hint="eastAsia"/>
+          <w:sz w:val="21"/>
+          <w:szCs w:val="21"/>
+        </w:rPr>
+        <w:t>：「提案が</w:t>
+      </w:r>
+      <w:r>
+        <w:rPr>
+          <w:rFonts w:ascii="Yu Gothic" w:eastAsia="Yu Gothic" w:hAnsi="Yu Gothic" w:hint="eastAsia"/>
+          <w:sz w:val="21"/>
+          <w:szCs w:val="21"/>
+        </w:rPr>
+        <w:t>実際に活用できるのか</w:t>
+      </w:r>
+      <w:r>
+        <w:rPr>
+          <w:rFonts w:ascii="Yu Gothic" w:eastAsia="Yu Gothic" w:hAnsi="Yu Gothic" w:hint="eastAsia"/>
+          <w:sz w:val="21"/>
+          <w:szCs w:val="21"/>
+        </w:rPr>
+        <w:t>は会社訪問で」と伝え、訪問のきっかけをつくる</w:t>
       </w:r>
     </w:p>
     <w:p>
       <w:pPr>
         <w:pStyle w:val="2"/>
         <w:rPr>
-          <w:rFonts w:ascii="游ゴシック" w:eastAsia="游ゴシック" w:hAnsi="游ゴシック" w:hint="eastAsia"/>
-        </w:rPr>
-      </w:pPr>
-      <w:r>
-        <w:rPr>
-          <w:rFonts w:ascii="游ゴシック" w:eastAsia="游ゴシック" w:hAnsi="游ゴシック" w:hint="eastAsia"/>
-        </w:rPr>
-        <w:t xml:space="preserve">4. </w:t>
-      </w:r>
-      <w:r>
-        <w:rPr>
-          <w:rFonts w:ascii="游ゴシック" w:eastAsia="游ゴシック" w:hAnsi="游ゴシック" w:hint="eastAsia"/>
-        </w:rPr>
-        <w:t>体験の進め方（</w:t>
-      </w:r>
-      <w:r>
-        <w:rPr>
-          <w:rFonts w:ascii="游ゴシック" w:eastAsia="游ゴシック" w:hAnsi="游ゴシック" w:hint="eastAsia"/>
-        </w:rPr>
-        <w:t>10</w:t>
-      </w:r>
-      <w:r>
-        <w:rPr>
-          <w:rFonts w:ascii="游ゴシック" w:eastAsia="游ゴシック" w:hAnsi="游ゴシック" w:hint="eastAsia"/>
-        </w:rPr>
-        <w:t>分）</w:t>
+          <w:rFonts w:ascii="Yu Gothic" w:eastAsia="Yu Gothic" w:hAnsi="Yu Gothic"/>
+        </w:rPr>
+      </w:pPr>
+      <w:r>
+        <w:rPr>
+          <w:rFonts w:ascii="Yu Gothic" w:eastAsia="Yu Gothic" w:hAnsi="Yu Gothic" w:hint="eastAsia"/>
+        </w:rPr>
+        <w:t>4. 体験の進め方（10分）</w:t>
       </w:r>
     </w:p>
     <w:tbl>
@@ -1005,7 +715,7 @@
           <w:p>
             <w:pPr>
               <w:rPr>
-                <w:rFonts w:ascii="游ゴシック" w:eastAsia="游ゴシック" w:hAnsi="游ゴシック" w:hint="eastAsia"/>
+                <w:rFonts w:ascii="Yu Gothic" w:eastAsia="Yu Gothic" w:hAnsi="Yu Gothic"/>
                 <w:b/>
                 <w:bCs/>
                 <w:sz w:val="20"/>
@@ -1014,7 +724,7 @@
             </w:pPr>
             <w:r>
               <w:rPr>
-                <w:rFonts w:ascii="游ゴシック" w:eastAsia="游ゴシック" w:hAnsi="游ゴシック" w:hint="eastAsia"/>
+                <w:rFonts w:ascii="Yu Gothic" w:eastAsia="Yu Gothic" w:hAnsi="Yu Gothic" w:hint="eastAsia"/>
                 <w:b/>
                 <w:bCs/>
                 <w:sz w:val="20"/>
@@ -1045,7 +755,7 @@
           <w:p>
             <w:pPr>
               <w:rPr>
-                <w:rFonts w:ascii="游ゴシック" w:eastAsia="游ゴシック" w:hAnsi="游ゴシック" w:hint="eastAsia"/>
+                <w:rFonts w:ascii="Yu Gothic" w:eastAsia="Yu Gothic" w:hAnsi="Yu Gothic"/>
                 <w:b/>
                 <w:bCs/>
                 <w:sz w:val="20"/>
@@ -1054,7 +764,7 @@
             </w:pPr>
             <w:r>
               <w:rPr>
-                <w:rFonts w:ascii="游ゴシック" w:eastAsia="游ゴシック" w:hAnsi="游ゴシック" w:hint="eastAsia"/>
+                <w:rFonts w:ascii="Yu Gothic" w:eastAsia="Yu Gothic" w:hAnsi="Yu Gothic" w:hint="eastAsia"/>
                 <w:b/>
                 <w:bCs/>
                 <w:sz w:val="20"/>
@@ -1085,7 +795,7 @@
           <w:p>
             <w:pPr>
               <w:rPr>
-                <w:rFonts w:ascii="游ゴシック" w:eastAsia="游ゴシック" w:hAnsi="游ゴシック" w:hint="eastAsia"/>
+                <w:rFonts w:ascii="Yu Gothic" w:eastAsia="Yu Gothic" w:hAnsi="Yu Gothic"/>
                 <w:b/>
                 <w:bCs/>
                 <w:sz w:val="20"/>
@@ -1094,7 +804,7 @@
             </w:pPr>
             <w:r>
               <w:rPr>
-                <w:rFonts w:ascii="游ゴシック" w:eastAsia="游ゴシック" w:hAnsi="游ゴシック" w:hint="eastAsia"/>
+                <w:rFonts w:ascii="Yu Gothic" w:eastAsia="Yu Gothic" w:hAnsi="Yu Gothic" w:hint="eastAsia"/>
                 <w:b/>
                 <w:bCs/>
                 <w:sz w:val="20"/>
@@ -1126,26 +836,18 @@
           <w:p>
             <w:pPr>
               <w:rPr>
-                <w:rFonts w:ascii="游ゴシック" w:eastAsia="游ゴシック" w:hAnsi="游ゴシック" w:hint="eastAsia"/>
+                <w:rFonts w:ascii="Yu Gothic" w:eastAsia="Yu Gothic" w:hAnsi="Yu Gothic"/>
                 <w:sz w:val="20"/>
                 <w:szCs w:val="20"/>
               </w:rPr>
             </w:pPr>
             <w:r>
               <w:rPr>
-                <w:rFonts w:ascii="游ゴシック" w:eastAsia="游ゴシック" w:hAnsi="游ゴシック" w:hint="eastAsia"/>
-                <w:sz w:val="20"/>
-                <w:szCs w:val="20"/>
-              </w:rPr>
-              <w:t>1</w:t>
-            </w:r>
-            <w:r>
-              <w:rPr>
-                <w:rFonts w:ascii="游ゴシック" w:eastAsia="游ゴシック" w:hAnsi="游ゴシック" w:hint="eastAsia"/>
-                <w:sz w:val="20"/>
-                <w:szCs w:val="20"/>
-              </w:rPr>
-              <w:t>分</w:t>
+                <w:rFonts w:ascii="Yu Gothic" w:eastAsia="Yu Gothic" w:hAnsi="Yu Gothic" w:hint="eastAsia"/>
+                <w:sz w:val="20"/>
+                <w:szCs w:val="20"/>
+              </w:rPr>
+              <w:t>1分</w:t>
             </w:r>
           </w:p>
         </w:tc>
@@ -1169,50 +871,18 @@
           <w:p>
             <w:pPr>
               <w:rPr>
-                <w:rFonts w:ascii="游ゴシック" w:eastAsia="游ゴシック" w:hAnsi="游ゴシック" w:hint="eastAsia"/>
+                <w:rFonts w:ascii="Yu Gothic" w:eastAsia="Yu Gothic" w:hAnsi="Yu Gothic"/>
                 <w:sz w:val="20"/>
                 <w:szCs w:val="20"/>
               </w:rPr>
             </w:pPr>
             <w:r>
               <w:rPr>
-                <w:rFonts w:ascii="游ゴシック" w:eastAsia="游ゴシック" w:hAnsi="游ゴシック" w:hint="eastAsia"/>
-                <w:sz w:val="20"/>
-                <w:szCs w:val="20"/>
-              </w:rPr>
-              <w:t>「今日はわしの建設に</w:t>
-            </w:r>
-            <w:r>
-              <w:rPr>
-                <w:rFonts w:ascii="游ゴシック" w:eastAsia="游ゴシック" w:hAnsi="游ゴシック" w:hint="eastAsia"/>
-                <w:sz w:val="20"/>
-                <w:szCs w:val="20"/>
-              </w:rPr>
-              <w:t>1</w:t>
-            </w:r>
-            <w:r>
-              <w:rPr>
-                <w:rFonts w:ascii="游ゴシック" w:eastAsia="游ゴシック" w:hAnsi="游ゴシック" w:hint="eastAsia"/>
-                <w:sz w:val="20"/>
-                <w:szCs w:val="20"/>
-              </w:rPr>
-              <w:t>つ提案してほしい。付箋</w:t>
-            </w:r>
-            <w:r>
-              <w:rPr>
-                <w:rFonts w:ascii="游ゴシック" w:eastAsia="游ゴシック" w:hAnsi="游ゴシック" w:hint="eastAsia"/>
-                <w:sz w:val="20"/>
-                <w:szCs w:val="20"/>
-              </w:rPr>
-              <w:t>1</w:t>
-            </w:r>
-            <w:r>
-              <w:rPr>
-                <w:rFonts w:ascii="游ゴシック" w:eastAsia="游ゴシック" w:hAnsi="游ゴシック" w:hint="eastAsia"/>
-                <w:sz w:val="20"/>
-                <w:szCs w:val="20"/>
-              </w:rPr>
-              <w:t>枚でいい」と伝える</w:t>
+                <w:rFonts w:ascii="Yu Gothic" w:eastAsia="Yu Gothic" w:hAnsi="Yu Gothic" w:hint="eastAsia"/>
+                <w:sz w:val="20"/>
+                <w:szCs w:val="20"/>
+              </w:rPr>
+              <w:t>「今日はわしの建設に1つ提案してほしい。付箋1枚でいい」と伝える</w:t>
             </w:r>
           </w:p>
         </w:tc>
@@ -1236,14 +906,14 @@
           <w:p>
             <w:pPr>
               <w:rPr>
-                <w:rFonts w:ascii="游ゴシック" w:eastAsia="游ゴシック" w:hAnsi="游ゴシック" w:hint="eastAsia"/>
+                <w:rFonts w:ascii="Yu Gothic" w:eastAsia="Yu Gothic" w:hAnsi="Yu Gothic"/>
                 <w:sz w:val="20"/>
                 <w:szCs w:val="20"/>
               </w:rPr>
             </w:pPr>
             <w:r>
               <w:rPr>
-                <w:rFonts w:ascii="游ゴシック" w:eastAsia="游ゴシック" w:hAnsi="游ゴシック" w:hint="eastAsia"/>
+                <w:rFonts w:ascii="Yu Gothic" w:eastAsia="Yu Gothic" w:hAnsi="Yu Gothic" w:hint="eastAsia"/>
                 <w:sz w:val="20"/>
                 <w:szCs w:val="20"/>
               </w:rPr>
@@ -1273,26 +943,18 @@
           <w:p>
             <w:pPr>
               <w:rPr>
-                <w:rFonts w:ascii="游ゴシック" w:eastAsia="游ゴシック" w:hAnsi="游ゴシック" w:hint="eastAsia"/>
+                <w:rFonts w:ascii="Yu Gothic" w:eastAsia="Yu Gothic" w:hAnsi="Yu Gothic"/>
                 <w:sz w:val="20"/>
                 <w:szCs w:val="20"/>
               </w:rPr>
             </w:pPr>
             <w:r>
               <w:rPr>
-                <w:rFonts w:ascii="游ゴシック" w:eastAsia="游ゴシック" w:hAnsi="游ゴシック" w:hint="eastAsia"/>
-                <w:sz w:val="20"/>
-                <w:szCs w:val="20"/>
-              </w:rPr>
-              <w:t>3</w:t>
-            </w:r>
-            <w:r>
-              <w:rPr>
-                <w:rFonts w:ascii="游ゴシック" w:eastAsia="游ゴシック" w:hAnsi="游ゴシック" w:hint="eastAsia"/>
-                <w:sz w:val="20"/>
-                <w:szCs w:val="20"/>
-              </w:rPr>
-              <w:t>分</w:t>
+                <w:rFonts w:ascii="Yu Gothic" w:eastAsia="Yu Gothic" w:hAnsi="Yu Gothic" w:hint="eastAsia"/>
+                <w:sz w:val="20"/>
+                <w:szCs w:val="20"/>
+              </w:rPr>
+              <w:t>3分</w:t>
             </w:r>
           </w:p>
         </w:tc>
@@ -1316,14 +978,14 @@
           <w:p>
             <w:pPr>
               <w:rPr>
-                <w:rFonts w:ascii="游ゴシック" w:eastAsia="游ゴシック" w:hAnsi="游ゴシック" w:hint="eastAsia"/>
+                <w:rFonts w:ascii="Yu Gothic" w:eastAsia="Yu Gothic" w:hAnsi="Yu Gothic"/>
                 <w:sz w:val="20"/>
                 <w:szCs w:val="20"/>
               </w:rPr>
             </w:pPr>
             <w:r>
               <w:rPr>
-                <w:rFonts w:ascii="游ゴシック" w:eastAsia="游ゴシック" w:hAnsi="游ゴシック" w:hint="eastAsia"/>
+                <w:rFonts w:ascii="Yu Gothic" w:eastAsia="Yu Gothic" w:hAnsi="Yu Gothic" w:hint="eastAsia"/>
                 <w:sz w:val="20"/>
                 <w:szCs w:val="20"/>
               </w:rPr>
@@ -1351,14 +1013,14 @@
           <w:p>
             <w:pPr>
               <w:rPr>
-                <w:rFonts w:ascii="游ゴシック" w:eastAsia="游ゴシック" w:hAnsi="游ゴシック" w:hint="eastAsia"/>
+                <w:rFonts w:ascii="Yu Gothic" w:eastAsia="Yu Gothic" w:hAnsi="Yu Gothic"/>
                 <w:sz w:val="20"/>
                 <w:szCs w:val="20"/>
               </w:rPr>
             </w:pPr>
             <w:r>
               <w:rPr>
-                <w:rFonts w:ascii="游ゴシック" w:eastAsia="游ゴシック" w:hAnsi="游ゴシック" w:hint="eastAsia"/>
+                <w:rFonts w:ascii="Yu Gothic" w:eastAsia="Yu Gothic" w:hAnsi="Yu Gothic" w:hint="eastAsia"/>
                 <w:sz w:val="20"/>
                 <w:szCs w:val="20"/>
               </w:rPr>
@@ -1388,26 +1050,18 @@
           <w:p>
             <w:pPr>
               <w:rPr>
-                <w:rFonts w:ascii="游ゴシック" w:eastAsia="游ゴシック" w:hAnsi="游ゴシック" w:hint="eastAsia"/>
+                <w:rFonts w:ascii="Yu Gothic" w:eastAsia="Yu Gothic" w:hAnsi="Yu Gothic"/>
                 <w:sz w:val="20"/>
                 <w:szCs w:val="20"/>
               </w:rPr>
             </w:pPr>
             <w:r>
               <w:rPr>
-                <w:rFonts w:ascii="游ゴシック" w:eastAsia="游ゴシック" w:hAnsi="游ゴシック" w:hint="eastAsia"/>
-                <w:sz w:val="20"/>
-                <w:szCs w:val="20"/>
-              </w:rPr>
-              <w:t>5</w:t>
-            </w:r>
-            <w:r>
-              <w:rPr>
-                <w:rFonts w:ascii="游ゴシック" w:eastAsia="游ゴシック" w:hAnsi="游ゴシック" w:hint="eastAsia"/>
-                <w:sz w:val="20"/>
-                <w:szCs w:val="20"/>
-              </w:rPr>
-              <w:t>分</w:t>
+                <w:rFonts w:ascii="Yu Gothic" w:eastAsia="Yu Gothic" w:hAnsi="Yu Gothic" w:hint="eastAsia"/>
+                <w:sz w:val="20"/>
+                <w:szCs w:val="20"/>
+              </w:rPr>
+              <w:t>5分</w:t>
             </w:r>
           </w:p>
         </w:tc>
@@ -1431,14 +1085,14 @@
           <w:p>
             <w:pPr>
               <w:rPr>
-                <w:rFonts w:ascii="游ゴシック" w:eastAsia="游ゴシック" w:hAnsi="游ゴシック" w:hint="eastAsia"/>
+                <w:rFonts w:ascii="Yu Gothic" w:eastAsia="Yu Gothic" w:hAnsi="Yu Gothic"/>
                 <w:sz w:val="20"/>
                 <w:szCs w:val="20"/>
               </w:rPr>
             </w:pPr>
             <w:r>
               <w:rPr>
-                <w:rFonts w:ascii="游ゴシック" w:eastAsia="游ゴシック" w:hAnsi="游ゴシック" w:hint="eastAsia"/>
+                <w:rFonts w:ascii="Yu Gothic" w:eastAsia="Yu Gothic" w:hAnsi="Yu Gothic" w:hint="eastAsia"/>
                 <w:sz w:val="20"/>
                 <w:szCs w:val="20"/>
               </w:rPr>
@@ -1466,14 +1120,14 @@
           <w:p>
             <w:pPr>
               <w:rPr>
-                <w:rFonts w:ascii="游ゴシック" w:eastAsia="游ゴシック" w:hAnsi="游ゴシック" w:hint="eastAsia"/>
+                <w:rFonts w:ascii="Yu Gothic" w:eastAsia="Yu Gothic" w:hAnsi="Yu Gothic"/>
                 <w:sz w:val="20"/>
                 <w:szCs w:val="20"/>
               </w:rPr>
             </w:pPr>
             <w:r>
               <w:rPr>
-                <w:rFonts w:ascii="游ゴシック" w:eastAsia="游ゴシック" w:hAnsi="游ゴシック" w:hint="eastAsia"/>
+                <w:rFonts w:ascii="Yu Gothic" w:eastAsia="Yu Gothic" w:hAnsi="Yu Gothic" w:hint="eastAsia"/>
                 <w:sz w:val="20"/>
                 <w:szCs w:val="20"/>
               </w:rPr>
@@ -1503,26 +1157,19 @@
           <w:p>
             <w:pPr>
               <w:rPr>
-                <w:rFonts w:ascii="游ゴシック" w:eastAsia="游ゴシック" w:hAnsi="游ゴシック" w:hint="eastAsia"/>
+                <w:rFonts w:ascii="Yu Gothic" w:eastAsia="Yu Gothic" w:hAnsi="Yu Gothic"/>
                 <w:sz w:val="20"/>
                 <w:szCs w:val="20"/>
               </w:rPr>
             </w:pPr>
             <w:r>
               <w:rPr>
-                <w:rFonts w:ascii="游ゴシック" w:eastAsia="游ゴシック" w:hAnsi="游ゴシック" w:hint="eastAsia"/>
-                <w:sz w:val="20"/>
-                <w:szCs w:val="20"/>
-              </w:rPr>
-              <w:t>1</w:t>
-            </w:r>
-            <w:r>
-              <w:rPr>
-                <w:rFonts w:ascii="游ゴシック" w:eastAsia="游ゴシック" w:hAnsi="游ゴシック" w:hint="eastAsia"/>
-                <w:sz w:val="20"/>
-                <w:szCs w:val="20"/>
-              </w:rPr>
-              <w:t>分</w:t>
+                <w:rFonts w:ascii="Yu Gothic" w:eastAsia="Yu Gothic" w:hAnsi="Yu Gothic" w:hint="eastAsia"/>
+                <w:sz w:val="20"/>
+                <w:szCs w:val="20"/>
+              </w:rPr>
+              <w:lastRenderedPageBreak/>
+              <w:t>1分</w:t>
             </w:r>
           </w:p>
         </w:tc>
@@ -1546,34 +1193,18 @@
           <w:p>
             <w:pPr>
               <w:rPr>
-                <w:rFonts w:ascii="游ゴシック" w:eastAsia="游ゴシック" w:hAnsi="游ゴシック" w:hint="eastAsia"/>
+                <w:rFonts w:ascii="Yu Gothic" w:eastAsia="Yu Gothic" w:hAnsi="Yu Gothic"/>
                 <w:sz w:val="20"/>
                 <w:szCs w:val="20"/>
               </w:rPr>
             </w:pPr>
             <w:r>
               <w:rPr>
-                <w:rFonts w:ascii="游ゴシック" w:eastAsia="游ゴシック" w:hAnsi="游ゴシック" w:hint="eastAsia"/>
-                <w:sz w:val="20"/>
-                <w:szCs w:val="20"/>
-              </w:rPr>
-              <w:t>社長がその場で提案に一言返す（</w:t>
-            </w:r>
-            <w:r>
-              <w:rPr>
-                <w:rFonts w:ascii="游ゴシック" w:eastAsia="游ゴシック" w:hAnsi="游ゴシック" w:hint="eastAsia"/>
-                <w:sz w:val="20"/>
-                <w:szCs w:val="20"/>
-              </w:rPr>
-              <w:t>30</w:t>
-            </w:r>
-            <w:r>
-              <w:rPr>
-                <w:rFonts w:ascii="游ゴシック" w:eastAsia="游ゴシック" w:hAnsi="游ゴシック" w:hint="eastAsia"/>
-                <w:sz w:val="20"/>
-                <w:szCs w:val="20"/>
-              </w:rPr>
-              <w:t>秒程度）。「どうなったかは会社訪問で」</w:t>
+                <w:rFonts w:ascii="Yu Gothic" w:eastAsia="Yu Gothic" w:hAnsi="Yu Gothic" w:hint="eastAsia"/>
+                <w:sz w:val="20"/>
+                <w:szCs w:val="20"/>
+              </w:rPr>
+              <w:t>社長がその場で提案に一言返す（30秒程度）。「どうなったかは会社訪問で」</w:t>
             </w:r>
           </w:p>
         </w:tc>
@@ -1597,14 +1228,14 @@
           <w:p>
             <w:pPr>
               <w:rPr>
-                <w:rFonts w:ascii="游ゴシック" w:eastAsia="游ゴシック" w:hAnsi="游ゴシック" w:hint="eastAsia"/>
+                <w:rFonts w:ascii="Yu Gothic" w:eastAsia="Yu Gothic" w:hAnsi="Yu Gothic"/>
                 <w:sz w:val="20"/>
                 <w:szCs w:val="20"/>
               </w:rPr>
             </w:pPr>
             <w:r>
               <w:rPr>
-                <w:rFonts w:ascii="游ゴシック" w:eastAsia="游ゴシック" w:hAnsi="游ゴシック" w:hint="eastAsia"/>
+                <w:rFonts w:ascii="Yu Gothic" w:eastAsia="Yu Gothic" w:hAnsi="Yu Gothic" w:hint="eastAsia"/>
                 <w:sz w:val="20"/>
                 <w:szCs w:val="20"/>
               </w:rPr>
@@ -1622,18 +1253,17 @@
         </w:numPr>
         <w:spacing w:after="40"/>
         <w:rPr>
-          <w:rFonts w:ascii="游ゴシック" w:eastAsia="游ゴシック" w:hAnsi="游ゴシック" w:hint="eastAsia"/>
-          <w:sz w:val="21"/>
-          <w:szCs w:val="21"/>
-        </w:rPr>
-      </w:pPr>
-      <w:r>
-        <w:rPr>
-          <w:rFonts w:ascii="游ゴシック" w:eastAsia="游ゴシック" w:hAnsi="游ゴシック" w:hint="eastAsia"/>
-          <w:sz w:val="21"/>
-          <w:szCs w:val="21"/>
-        </w:rPr>
-        <w:lastRenderedPageBreak/>
+          <w:rFonts w:ascii="Yu Gothic" w:eastAsia="Yu Gothic" w:hAnsi="Yu Gothic"/>
+          <w:sz w:val="21"/>
+          <w:szCs w:val="21"/>
+        </w:rPr>
+      </w:pPr>
+      <w:r>
+        <w:rPr>
+          <w:rFonts w:ascii="Yu Gothic" w:eastAsia="Yu Gothic" w:hAnsi="Yu Gothic" w:hint="eastAsia"/>
+          <w:sz w:val="21"/>
+          <w:szCs w:val="21"/>
+        </w:rPr>
         <w:t>困りごとを先に聞き、改造案は後から聞く（いきなり改造案を求めると手が止まるため）</w:t>
       </w:r>
     </w:p>
@@ -1645,34 +1275,18 @@
         </w:numPr>
         <w:spacing w:after="40"/>
         <w:rPr>
-          <w:rFonts w:ascii="游ゴシック" w:eastAsia="游ゴシック" w:hAnsi="游ゴシック" w:hint="eastAsia"/>
-          <w:sz w:val="21"/>
-          <w:szCs w:val="21"/>
-        </w:rPr>
-      </w:pPr>
-      <w:r>
-        <w:rPr>
-          <w:rFonts w:ascii="游ゴシック" w:eastAsia="游ゴシック" w:hAnsi="游ゴシック" w:hint="eastAsia"/>
-          <w:sz w:val="21"/>
-          <w:szCs w:val="21"/>
-        </w:rPr>
-        <w:t>書いた付箋はボードに貼り、</w:t>
-      </w:r>
-      <w:r>
-        <w:rPr>
-          <w:rFonts w:ascii="游ゴシック" w:eastAsia="游ゴシック" w:hAnsi="游ゴシック" w:hint="eastAsia"/>
-          <w:sz w:val="21"/>
-          <w:szCs w:val="21"/>
-        </w:rPr>
-        <w:t>1</w:t>
-      </w:r>
-      <w:r>
-        <w:rPr>
-          <w:rFonts w:ascii="游ゴシック" w:eastAsia="游ゴシック" w:hAnsi="游ゴシック" w:hint="eastAsia"/>
-          <w:sz w:val="21"/>
-          <w:szCs w:val="21"/>
-        </w:rPr>
-        <w:t>日を通して溜めていく。前の組の付箋も話のきっかけに使う</w:t>
+          <w:rFonts w:ascii="Yu Gothic" w:eastAsia="Yu Gothic" w:hAnsi="Yu Gothic"/>
+          <w:sz w:val="21"/>
+          <w:szCs w:val="21"/>
+        </w:rPr>
+      </w:pPr>
+      <w:r>
+        <w:rPr>
+          <w:rFonts w:ascii="Yu Gothic" w:eastAsia="Yu Gothic" w:hAnsi="Yu Gothic" w:hint="eastAsia"/>
+          <w:sz w:val="21"/>
+          <w:szCs w:val="21"/>
+        </w:rPr>
+        <w:t>書いた付箋はボードに貼り、1日を通して溜めていく。前の組の付箋も話のきっかけに使う</w:t>
       </w:r>
     </w:p>
     <w:p>
@@ -1683,14 +1297,14 @@
         </w:numPr>
         <w:spacing w:after="40"/>
         <w:rPr>
-          <w:rFonts w:ascii="游ゴシック" w:eastAsia="游ゴシック" w:hAnsi="游ゴシック" w:hint="eastAsia"/>
-          <w:sz w:val="21"/>
-          <w:szCs w:val="21"/>
-        </w:rPr>
-      </w:pPr>
-      <w:r>
-        <w:rPr>
-          <w:rFonts w:ascii="游ゴシック" w:eastAsia="游ゴシック" w:hAnsi="游ゴシック" w:hint="eastAsia"/>
+          <w:rFonts w:ascii="Yu Gothic" w:eastAsia="Yu Gothic" w:hAnsi="Yu Gothic"/>
+          <w:sz w:val="21"/>
+          <w:szCs w:val="21"/>
+        </w:rPr>
+      </w:pPr>
+      <w:r>
+        <w:rPr>
+          <w:rFonts w:ascii="Yu Gothic" w:eastAsia="Yu Gothic" w:hAnsi="Yu Gothic" w:hint="eastAsia"/>
           <w:sz w:val="21"/>
           <w:szCs w:val="21"/>
         </w:rPr>
@@ -1701,20 +1315,14 @@
       <w:pPr>
         <w:pStyle w:val="2"/>
         <w:rPr>
-          <w:rFonts w:ascii="游ゴシック" w:eastAsia="游ゴシック" w:hAnsi="游ゴシック" w:hint="eastAsia"/>
-        </w:rPr>
-      </w:pPr>
-      <w:r>
-        <w:rPr>
-          <w:rFonts w:ascii="游ゴシック" w:eastAsia="游ゴシック" w:hAnsi="游ゴシック" w:hint="eastAsia"/>
-        </w:rPr>
-        <w:t xml:space="preserve">5. </w:t>
-      </w:r>
-      <w:r>
-        <w:rPr>
-          <w:rFonts w:ascii="游ゴシック" w:eastAsia="游ゴシック" w:hAnsi="游ゴシック" w:hint="eastAsia"/>
-        </w:rPr>
-        <w:t>当日の役割分担</w:t>
+          <w:rFonts w:ascii="Yu Gothic" w:eastAsia="Yu Gothic" w:hAnsi="Yu Gothic"/>
+        </w:rPr>
+      </w:pPr>
+      <w:r>
+        <w:rPr>
+          <w:rFonts w:ascii="Yu Gothic" w:eastAsia="Yu Gothic" w:hAnsi="Yu Gothic" w:hint="eastAsia"/>
+        </w:rPr>
+        <w:t>5. 当日の役割分担</w:t>
       </w:r>
     </w:p>
     <w:tbl>
@@ -1754,7 +1362,7 @@
           <w:p>
             <w:pPr>
               <w:rPr>
-                <w:rFonts w:ascii="游ゴシック" w:eastAsia="游ゴシック" w:hAnsi="游ゴシック" w:hint="eastAsia"/>
+                <w:rFonts w:ascii="Yu Gothic" w:eastAsia="Yu Gothic" w:hAnsi="Yu Gothic"/>
                 <w:b/>
                 <w:bCs/>
                 <w:sz w:val="20"/>
@@ -1763,7 +1371,7 @@
             </w:pPr>
             <w:r>
               <w:rPr>
-                <w:rFonts w:ascii="游ゴシック" w:eastAsia="游ゴシック" w:hAnsi="游ゴシック" w:hint="eastAsia"/>
+                <w:rFonts w:ascii="Yu Gothic" w:eastAsia="Yu Gothic" w:hAnsi="Yu Gothic" w:hint="eastAsia"/>
                 <w:b/>
                 <w:bCs/>
                 <w:sz w:val="20"/>
@@ -1794,7 +1402,7 @@
           <w:p>
             <w:pPr>
               <w:rPr>
-                <w:rFonts w:ascii="游ゴシック" w:eastAsia="游ゴシック" w:hAnsi="游ゴシック" w:hint="eastAsia"/>
+                <w:rFonts w:ascii="Yu Gothic" w:eastAsia="Yu Gothic" w:hAnsi="Yu Gothic"/>
                 <w:b/>
                 <w:bCs/>
                 <w:sz w:val="20"/>
@@ -1803,7 +1411,7 @@
             </w:pPr>
             <w:r>
               <w:rPr>
-                <w:rFonts w:ascii="游ゴシック" w:eastAsia="游ゴシック" w:hAnsi="游ゴシック" w:hint="eastAsia"/>
+                <w:rFonts w:ascii="Yu Gothic" w:eastAsia="Yu Gothic" w:hAnsi="Yu Gothic" w:hint="eastAsia"/>
                 <w:b/>
                 <w:bCs/>
                 <w:sz w:val="20"/>
@@ -1835,14 +1443,14 @@
           <w:p>
             <w:pPr>
               <w:rPr>
-                <w:rFonts w:ascii="游ゴシック" w:eastAsia="游ゴシック" w:hAnsi="游ゴシック" w:hint="eastAsia"/>
+                <w:rFonts w:ascii="Yu Gothic" w:eastAsia="Yu Gothic" w:hAnsi="Yu Gothic"/>
                 <w:sz w:val="20"/>
                 <w:szCs w:val="20"/>
               </w:rPr>
             </w:pPr>
             <w:r>
               <w:rPr>
-                <w:rFonts w:ascii="游ゴシック" w:eastAsia="游ゴシック" w:hAnsi="游ゴシック" w:hint="eastAsia"/>
+                <w:rFonts w:ascii="Yu Gothic" w:eastAsia="Yu Gothic" w:hAnsi="Yu Gothic" w:hint="eastAsia"/>
                 <w:sz w:val="20"/>
                 <w:szCs w:val="20"/>
               </w:rPr>
@@ -1870,34 +1478,18 @@
           <w:p>
             <w:pPr>
               <w:rPr>
-                <w:rFonts w:ascii="游ゴシック" w:eastAsia="游ゴシック" w:hAnsi="游ゴシック" w:hint="eastAsia"/>
+                <w:rFonts w:ascii="Yu Gothic" w:eastAsia="Yu Gothic" w:hAnsi="Yu Gothic"/>
                 <w:sz w:val="20"/>
                 <w:szCs w:val="20"/>
               </w:rPr>
             </w:pPr>
             <w:r>
               <w:rPr>
-                <w:rFonts w:ascii="游ゴシック" w:eastAsia="游ゴシック" w:hAnsi="游ゴシック" w:hint="eastAsia"/>
-                <w:sz w:val="20"/>
-                <w:szCs w:val="20"/>
-              </w:rPr>
-              <w:t>会社説明（</w:t>
-            </w:r>
-            <w:r>
-              <w:rPr>
-                <w:rFonts w:ascii="游ゴシック" w:eastAsia="游ゴシック" w:hAnsi="游ゴシック" w:hint="eastAsia"/>
-                <w:sz w:val="20"/>
-                <w:szCs w:val="20"/>
-              </w:rPr>
-              <w:t>5</w:t>
-            </w:r>
-            <w:r>
-              <w:rPr>
-                <w:rFonts w:ascii="游ゴシック" w:eastAsia="游ゴシック" w:hAnsi="游ゴシック" w:hint="eastAsia"/>
-                <w:sz w:val="20"/>
-                <w:szCs w:val="20"/>
-              </w:rPr>
-              <w:t>分）／学生の提案にその場で一言返す</w:t>
+                <w:rFonts w:ascii="Yu Gothic" w:eastAsia="Yu Gothic" w:hAnsi="Yu Gothic" w:hint="eastAsia"/>
+                <w:sz w:val="20"/>
+                <w:szCs w:val="20"/>
+              </w:rPr>
+              <w:t>会社説明（5分）／学生の提案にその場で一言返す</w:t>
             </w:r>
           </w:p>
         </w:tc>
@@ -1923,14 +1515,14 @@
           <w:p>
             <w:pPr>
               <w:rPr>
-                <w:rFonts w:ascii="游ゴシック" w:eastAsia="游ゴシック" w:hAnsi="游ゴシック" w:hint="eastAsia"/>
+                <w:rFonts w:ascii="Yu Gothic" w:eastAsia="Yu Gothic" w:hAnsi="Yu Gothic"/>
                 <w:sz w:val="20"/>
                 <w:szCs w:val="20"/>
               </w:rPr>
             </w:pPr>
             <w:r>
               <w:rPr>
-                <w:rFonts w:ascii="游ゴシック" w:eastAsia="游ゴシック" w:hAnsi="游ゴシック" w:hint="eastAsia"/>
+                <w:rFonts w:ascii="Yu Gothic" w:eastAsia="Yu Gothic" w:hAnsi="Yu Gothic" w:hint="eastAsia"/>
                 <w:sz w:val="20"/>
                 <w:szCs w:val="20"/>
               </w:rPr>
@@ -1958,14 +1550,14 @@
           <w:p>
             <w:pPr>
               <w:rPr>
-                <w:rFonts w:ascii="游ゴシック" w:eastAsia="游ゴシック" w:hAnsi="游ゴシック" w:hint="eastAsia"/>
+                <w:rFonts w:ascii="Yu Gothic" w:eastAsia="Yu Gothic" w:hAnsi="Yu Gothic"/>
                 <w:sz w:val="20"/>
                 <w:szCs w:val="20"/>
               </w:rPr>
             </w:pPr>
             <w:r>
               <w:rPr>
-                <w:rFonts w:ascii="游ゴシック" w:eastAsia="游ゴシック" w:hAnsi="游ゴシック" w:hint="eastAsia"/>
+                <w:rFonts w:ascii="Yu Gothic" w:eastAsia="Yu Gothic" w:hAnsi="Yu Gothic" w:hint="eastAsia"/>
                 <w:sz w:val="20"/>
                 <w:szCs w:val="20"/>
               </w:rPr>
@@ -1983,34 +1575,18 @@
         </w:numPr>
         <w:spacing w:after="40"/>
         <w:rPr>
-          <w:rFonts w:ascii="游ゴシック" w:eastAsia="游ゴシック" w:hAnsi="游ゴシック" w:hint="eastAsia"/>
-          <w:sz w:val="21"/>
-          <w:szCs w:val="21"/>
-        </w:rPr>
-      </w:pPr>
-      <w:r>
-        <w:rPr>
-          <w:rFonts w:ascii="游ゴシック" w:eastAsia="游ゴシック" w:hAnsi="游ゴシック" w:hint="eastAsia"/>
-          <w:sz w:val="21"/>
-          <w:szCs w:val="21"/>
-        </w:rPr>
-        <w:t>社長の一言は短く（</w:t>
-      </w:r>
-      <w:r>
-        <w:rPr>
-          <w:rFonts w:ascii="游ゴシック" w:eastAsia="游ゴシック" w:hAnsi="游ゴシック" w:hint="eastAsia"/>
-          <w:sz w:val="21"/>
-          <w:szCs w:val="21"/>
-        </w:rPr>
-        <w:t>30</w:t>
-      </w:r>
-      <w:r>
-        <w:rPr>
-          <w:rFonts w:ascii="游ゴシック" w:eastAsia="游ゴシック" w:hAnsi="游ゴシック" w:hint="eastAsia"/>
-          <w:sz w:val="21"/>
-          <w:szCs w:val="21"/>
-        </w:rPr>
-        <w:t>秒程度）。長くなると学生が緊張し、次の組の時間も押す</w:t>
+          <w:rFonts w:ascii="Yu Gothic" w:eastAsia="Yu Gothic" w:hAnsi="Yu Gothic"/>
+          <w:sz w:val="21"/>
+          <w:szCs w:val="21"/>
+        </w:rPr>
+      </w:pPr>
+      <w:r>
+        <w:rPr>
+          <w:rFonts w:ascii="Yu Gothic" w:eastAsia="Yu Gothic" w:hAnsi="Yu Gothic" w:hint="eastAsia"/>
+          <w:sz w:val="21"/>
+          <w:szCs w:val="21"/>
+        </w:rPr>
+        <w:t>社長の一言は短く（30秒程度）。長くなると学生が緊張し、次の組の時間も押す</w:t>
       </w:r>
     </w:p>
     <w:p>
@@ -2021,70 +1597,32 @@
         </w:numPr>
         <w:spacing w:after="40"/>
         <w:rPr>
-          <w:rFonts w:ascii="游ゴシック" w:eastAsia="游ゴシック" w:hAnsi="游ゴシック" w:hint="eastAsia"/>
-          <w:sz w:val="21"/>
-          <w:szCs w:val="21"/>
-        </w:rPr>
-      </w:pPr>
-      <w:r>
-        <w:rPr>
-          <w:rFonts w:ascii="游ゴシック" w:eastAsia="游ゴシック" w:hAnsi="游ゴシック" w:hint="eastAsia"/>
-          <w:sz w:val="21"/>
-          <w:szCs w:val="21"/>
-        </w:rPr>
-        <w:t>任意：</w:t>
-      </w:r>
-      <w:r>
-        <w:rPr>
-          <w:rFonts w:ascii="游ゴシック" w:eastAsia="游ゴシック" w:hAnsi="游ゴシック" w:hint="eastAsia"/>
-          <w:sz w:val="21"/>
-          <w:szCs w:val="21"/>
-        </w:rPr>
-        <w:t>1</w:t>
-      </w:r>
-      <w:r>
-        <w:rPr>
-          <w:rFonts w:ascii="游ゴシック" w:eastAsia="游ゴシック" w:hAnsi="游ゴシック" w:hint="eastAsia"/>
-          <w:sz w:val="21"/>
-          <w:szCs w:val="21"/>
-        </w:rPr>
-        <w:t>日の終わりに社長が「いいね」と思った提案を選び、</w:t>
-      </w:r>
-      <w:r>
-        <w:rPr>
-          <w:rFonts w:ascii="游ゴシック" w:eastAsia="游ゴシック" w:hAnsi="游ゴシック" w:hint="eastAsia"/>
-          <w:sz w:val="21"/>
-          <w:szCs w:val="21"/>
-        </w:rPr>
-        <w:t>Instagram</w:t>
-      </w:r>
-      <w:r>
-        <w:rPr>
-          <w:rFonts w:ascii="游ゴシック" w:eastAsia="游ゴシック" w:hAnsi="游ゴシック" w:hint="eastAsia"/>
-          <w:sz w:val="21"/>
-          <w:szCs w:val="21"/>
-        </w:rPr>
-        <w:t>で紹介する</w:t>
+          <w:rFonts w:ascii="Yu Gothic" w:eastAsia="Yu Gothic" w:hAnsi="Yu Gothic"/>
+          <w:sz w:val="21"/>
+          <w:szCs w:val="21"/>
+        </w:rPr>
+      </w:pPr>
+      <w:r>
+        <w:rPr>
+          <w:rFonts w:ascii="Yu Gothic" w:eastAsia="Yu Gothic" w:hAnsi="Yu Gothic" w:hint="eastAsia"/>
+          <w:sz w:val="21"/>
+          <w:szCs w:val="21"/>
+        </w:rPr>
+        <w:t>任意：1日の終わりに社長が「いいね」と思った提案を選び、Instagramで紹介する</w:t>
       </w:r>
     </w:p>
     <w:p>
       <w:pPr>
         <w:pStyle w:val="2"/>
         <w:rPr>
-          <w:rFonts w:ascii="游ゴシック" w:eastAsia="游ゴシック" w:hAnsi="游ゴシック" w:hint="eastAsia"/>
-        </w:rPr>
-      </w:pPr>
-      <w:r>
-        <w:rPr>
-          <w:rFonts w:ascii="游ゴシック" w:eastAsia="游ゴシック" w:hAnsi="游ゴシック" w:hint="eastAsia"/>
-        </w:rPr>
-        <w:t xml:space="preserve">6. </w:t>
-      </w:r>
-      <w:r>
-        <w:rPr>
-          <w:rFonts w:ascii="游ゴシック" w:eastAsia="游ゴシック" w:hAnsi="游ゴシック" w:hint="eastAsia"/>
-        </w:rPr>
-        <w:t>準備物</w:t>
+          <w:rFonts w:ascii="Yu Gothic" w:eastAsia="Yu Gothic" w:hAnsi="Yu Gothic"/>
+        </w:rPr>
+      </w:pPr>
+      <w:r>
+        <w:rPr>
+          <w:rFonts w:ascii="Yu Gothic" w:eastAsia="Yu Gothic" w:hAnsi="Yu Gothic" w:hint="eastAsia"/>
+        </w:rPr>
+        <w:t>6. 準備物</w:t>
       </w:r>
     </w:p>
     <w:p>
@@ -2095,14 +1633,14 @@
         </w:numPr>
         <w:spacing w:after="40"/>
         <w:rPr>
-          <w:rFonts w:ascii="游ゴシック" w:eastAsia="游ゴシック" w:hAnsi="游ゴシック" w:hint="eastAsia"/>
-          <w:sz w:val="21"/>
-          <w:szCs w:val="21"/>
-        </w:rPr>
-      </w:pPr>
-      <w:r>
-        <w:rPr>
-          <w:rFonts w:ascii="游ゴシック" w:eastAsia="游ゴシック" w:hAnsi="游ゴシック" w:hint="eastAsia"/>
+          <w:rFonts w:ascii="Yu Gothic" w:eastAsia="Yu Gothic" w:hAnsi="Yu Gothic"/>
+          <w:sz w:val="21"/>
+          <w:szCs w:val="21"/>
+        </w:rPr>
+      </w:pPr>
+      <w:r>
+        <w:rPr>
+          <w:rFonts w:ascii="Yu Gothic" w:eastAsia="Yu Gothic" w:hAnsi="Yu Gothic" w:hint="eastAsia"/>
           <w:sz w:val="21"/>
           <w:szCs w:val="21"/>
         </w:rPr>
@@ -2117,34 +1655,18 @@
         </w:numPr>
         <w:spacing w:after="40"/>
         <w:rPr>
-          <w:rFonts w:ascii="游ゴシック" w:eastAsia="游ゴシック" w:hAnsi="游ゴシック" w:hint="eastAsia"/>
-          <w:sz w:val="21"/>
-          <w:szCs w:val="21"/>
-        </w:rPr>
-      </w:pPr>
-      <w:r>
-        <w:rPr>
-          <w:rFonts w:ascii="游ゴシック" w:eastAsia="游ゴシック" w:hAnsi="游ゴシック" w:hint="eastAsia"/>
-          <w:sz w:val="21"/>
-          <w:szCs w:val="21"/>
-        </w:rPr>
-        <w:t>付箋を貼るボード（②と①の</w:t>
-      </w:r>
-      <w:r>
-        <w:rPr>
-          <w:rFonts w:ascii="游ゴシック" w:eastAsia="游ゴシック" w:hAnsi="游ゴシック" w:hint="eastAsia"/>
-          <w:sz w:val="21"/>
-          <w:szCs w:val="21"/>
-        </w:rPr>
-        <w:t>2</w:t>
-      </w:r>
-      <w:r>
-        <w:rPr>
-          <w:rFonts w:ascii="游ゴシック" w:eastAsia="游ゴシック" w:hAnsi="游ゴシック" w:hint="eastAsia"/>
-          <w:sz w:val="21"/>
-          <w:szCs w:val="21"/>
-        </w:rPr>
-        <w:t>面）</w:t>
+          <w:rFonts w:ascii="Yu Gothic" w:eastAsia="Yu Gothic" w:hAnsi="Yu Gothic"/>
+          <w:sz w:val="21"/>
+          <w:szCs w:val="21"/>
+        </w:rPr>
+      </w:pPr>
+      <w:r>
+        <w:rPr>
+          <w:rFonts w:ascii="Yu Gothic" w:eastAsia="Yu Gothic" w:hAnsi="Yu Gothic" w:hint="eastAsia"/>
+          <w:sz w:val="21"/>
+          <w:szCs w:val="21"/>
+        </w:rPr>
+        <w:t>付箋を貼るボード（②と①の2面）</w:t>
       </w:r>
     </w:p>
     <w:p>
@@ -2155,14 +1677,14 @@
         </w:numPr>
         <w:spacing w:after="40"/>
         <w:rPr>
-          <w:rFonts w:ascii="游ゴシック" w:eastAsia="游ゴシック" w:hAnsi="游ゴシック" w:hint="eastAsia"/>
-          <w:sz w:val="21"/>
-          <w:szCs w:val="21"/>
-        </w:rPr>
-      </w:pPr>
-      <w:r>
-        <w:rPr>
-          <w:rFonts w:ascii="游ゴシック" w:eastAsia="游ゴシック" w:hAnsi="游ゴシック" w:hint="eastAsia"/>
+          <w:rFonts w:ascii="Yu Gothic" w:eastAsia="Yu Gothic" w:hAnsi="Yu Gothic"/>
+          <w:sz w:val="21"/>
+          <w:szCs w:val="21"/>
+        </w:rPr>
+      </w:pPr>
+      <w:r>
+        <w:rPr>
+          <w:rFonts w:ascii="Yu Gothic" w:eastAsia="Yu Gothic" w:hAnsi="Yu Gothic" w:hint="eastAsia"/>
           <w:sz w:val="21"/>
           <w:szCs w:val="21"/>
         </w:rPr>
@@ -2177,54 +1699,32 @@
         </w:numPr>
         <w:spacing w:after="40"/>
         <w:rPr>
-          <w:rFonts w:ascii="游ゴシック" w:eastAsia="游ゴシック" w:hAnsi="游ゴシック" w:hint="eastAsia"/>
-          <w:sz w:val="21"/>
-          <w:szCs w:val="21"/>
-        </w:rPr>
-      </w:pPr>
-      <w:r>
-        <w:rPr>
-          <w:rFonts w:ascii="游ゴシック" w:eastAsia="游ゴシック" w:hAnsi="游ゴシック" w:hint="eastAsia"/>
-          <w:sz w:val="21"/>
-          <w:szCs w:val="21"/>
-        </w:rPr>
-        <w:t>会社紹介資料、会社訪問・インターン案内（チラシまたは</w:t>
-      </w:r>
-      <w:r>
-        <w:rPr>
-          <w:rFonts w:ascii="游ゴシック" w:eastAsia="游ゴシック" w:hAnsi="游ゴシック" w:hint="eastAsia"/>
-          <w:sz w:val="21"/>
-          <w:szCs w:val="21"/>
-        </w:rPr>
-        <w:t>QR</w:t>
-      </w:r>
-      <w:r>
-        <w:rPr>
-          <w:rFonts w:ascii="游ゴシック" w:eastAsia="游ゴシック" w:hAnsi="游ゴシック" w:hint="eastAsia"/>
-          <w:sz w:val="21"/>
-          <w:szCs w:val="21"/>
-        </w:rPr>
-        <w:t>コード）</w:t>
+          <w:rFonts w:ascii="Yu Gothic" w:eastAsia="Yu Gothic" w:hAnsi="Yu Gothic"/>
+          <w:sz w:val="21"/>
+          <w:szCs w:val="21"/>
+        </w:rPr>
+      </w:pPr>
+      <w:r>
+        <w:rPr>
+          <w:rFonts w:ascii="Yu Gothic" w:eastAsia="Yu Gothic" w:hAnsi="Yu Gothic" w:hint="eastAsia"/>
+          <w:sz w:val="21"/>
+          <w:szCs w:val="21"/>
+        </w:rPr>
+        <w:t>会社紹介資料、会社訪問・インターン案内（チラシまたはQRコード）</w:t>
       </w:r>
     </w:p>
     <w:p>
       <w:pPr>
         <w:pStyle w:val="2"/>
         <w:rPr>
-          <w:rFonts w:ascii="游ゴシック" w:eastAsia="游ゴシック" w:hAnsi="游ゴシック" w:hint="eastAsia"/>
-        </w:rPr>
-      </w:pPr>
-      <w:r>
-        <w:rPr>
-          <w:rFonts w:ascii="游ゴシック" w:eastAsia="游ゴシック" w:hAnsi="游ゴシック" w:hint="eastAsia"/>
-        </w:rPr>
-        <w:t xml:space="preserve">7. </w:t>
-      </w:r>
-      <w:r>
-        <w:rPr>
-          <w:rFonts w:ascii="游ゴシック" w:eastAsia="游ゴシック" w:hAnsi="游ゴシック" w:hint="eastAsia"/>
-        </w:rPr>
-        <w:t>終了後の活用</w:t>
+          <w:rFonts w:ascii="Yu Gothic" w:eastAsia="Yu Gothic" w:hAnsi="Yu Gothic"/>
+        </w:rPr>
+      </w:pPr>
+      <w:r>
+        <w:rPr>
+          <w:rFonts w:ascii="Yu Gothic" w:eastAsia="Yu Gothic" w:hAnsi="Yu Gothic" w:hint="eastAsia"/>
+        </w:rPr>
+        <w:t>7. 終了後の活用</w:t>
       </w:r>
     </w:p>
     <w:p>
@@ -2235,50 +1735,18 @@
         </w:numPr>
         <w:spacing w:after="40"/>
         <w:rPr>
-          <w:rFonts w:ascii="游ゴシック" w:eastAsia="游ゴシック" w:hAnsi="游ゴシック" w:hint="eastAsia"/>
-          <w:sz w:val="21"/>
-          <w:szCs w:val="21"/>
-        </w:rPr>
-      </w:pPr>
-      <w:r>
-        <w:rPr>
-          <w:rFonts w:ascii="游ゴシック" w:eastAsia="游ゴシック" w:hAnsi="游ゴシック" w:hint="eastAsia"/>
-          <w:sz w:val="21"/>
-          <w:szCs w:val="21"/>
-        </w:rPr>
-        <w:t>付箋を集計し、</w:t>
-      </w:r>
-      <w:r>
-        <w:rPr>
-          <w:rFonts w:ascii="游ゴシック" w:eastAsia="游ゴシック" w:hAnsi="游ゴシック" w:hint="eastAsia"/>
-          <w:sz w:val="21"/>
-          <w:szCs w:val="21"/>
-        </w:rPr>
-        <w:t>Web</w:t>
-      </w:r>
-      <w:r>
-        <w:rPr>
-          <w:rFonts w:ascii="游ゴシック" w:eastAsia="游ゴシック" w:hAnsi="游ゴシック" w:hint="eastAsia"/>
-          <w:sz w:val="21"/>
-          <w:szCs w:val="21"/>
-        </w:rPr>
-        <w:t>サイト・</w:t>
-      </w:r>
-      <w:r>
-        <w:rPr>
-          <w:rFonts w:ascii="游ゴシック" w:eastAsia="游ゴシック" w:hAnsi="游ゴシック" w:hint="eastAsia"/>
-          <w:sz w:val="21"/>
-          <w:szCs w:val="21"/>
-        </w:rPr>
-        <w:t>Instagram</w:t>
-      </w:r>
-      <w:r>
-        <w:rPr>
-          <w:rFonts w:ascii="游ゴシック" w:eastAsia="游ゴシック" w:hAnsi="游ゴシック" w:hint="eastAsia"/>
-          <w:sz w:val="21"/>
-          <w:szCs w:val="21"/>
-        </w:rPr>
-        <w:t>・営業資料の改善に使えるものを選ぶ</w:t>
+          <w:rFonts w:ascii="Yu Gothic" w:eastAsia="Yu Gothic" w:hAnsi="Yu Gothic"/>
+          <w:sz w:val="21"/>
+          <w:szCs w:val="21"/>
+        </w:rPr>
+      </w:pPr>
+      <w:r>
+        <w:rPr>
+          <w:rFonts w:ascii="Yu Gothic" w:eastAsia="Yu Gothic" w:hAnsi="Yu Gothic" w:hint="eastAsia"/>
+          <w:sz w:val="21"/>
+          <w:szCs w:val="21"/>
+        </w:rPr>
+        <w:t>付箋を集計し、Webサイト・Instagram・営業資料の改善に使えるものを選ぶ</w:t>
       </w:r>
     </w:p>
     <w:p>
@@ -2289,34 +1757,18 @@
         </w:numPr>
         <w:spacing w:after="40"/>
         <w:rPr>
-          <w:rFonts w:ascii="游ゴシック" w:eastAsia="游ゴシック" w:hAnsi="游ゴシック" w:hint="eastAsia"/>
-          <w:sz w:val="21"/>
-          <w:szCs w:val="21"/>
-        </w:rPr>
-      </w:pPr>
-      <w:r>
-        <w:rPr>
-          <w:rFonts w:ascii="游ゴシック" w:eastAsia="游ゴシック" w:hAnsi="游ゴシック" w:hint="eastAsia"/>
-          <w:sz w:val="21"/>
-          <w:szCs w:val="21"/>
-        </w:rPr>
-        <w:t>実際に取り入れたものは、会社訪問や</w:t>
-      </w:r>
-      <w:r>
-        <w:rPr>
-          <w:rFonts w:ascii="游ゴシック" w:eastAsia="游ゴシック" w:hAnsi="游ゴシック" w:hint="eastAsia"/>
-          <w:sz w:val="21"/>
-          <w:szCs w:val="21"/>
-        </w:rPr>
-        <w:t>Instagram</w:t>
-      </w:r>
-      <w:r>
-        <w:rPr>
-          <w:rFonts w:ascii="游ゴシック" w:eastAsia="游ゴシック" w:hAnsi="游ゴシック" w:hint="eastAsia"/>
-          <w:sz w:val="21"/>
-          <w:szCs w:val="21"/>
-        </w:rPr>
-        <w:t>で「みんなの提案でこう変えた」と学生に返す</w:t>
+          <w:rFonts w:ascii="Yu Gothic" w:eastAsia="Yu Gothic" w:hAnsi="Yu Gothic"/>
+          <w:sz w:val="21"/>
+          <w:szCs w:val="21"/>
+        </w:rPr>
+      </w:pPr>
+      <w:r>
+        <w:rPr>
+          <w:rFonts w:ascii="Yu Gothic" w:eastAsia="Yu Gothic" w:hAnsi="Yu Gothic" w:hint="eastAsia"/>
+          <w:sz w:val="21"/>
+          <w:szCs w:val="21"/>
+        </w:rPr>
+        <w:t>実際に取り入れたものは、会社訪問やInstagramで「みんなの提案でこう変えた」と学生に返す</w:t>
       </w:r>
     </w:p>
     <w:p>
@@ -2327,14 +1779,14 @@
         </w:numPr>
         <w:spacing w:after="40"/>
         <w:rPr>
-          <w:rFonts w:ascii="游ゴシック" w:eastAsia="游ゴシック" w:hAnsi="游ゴシック" w:hint="eastAsia"/>
-          <w:sz w:val="21"/>
-          <w:szCs w:val="21"/>
-        </w:rPr>
-      </w:pPr>
-      <w:r>
-        <w:rPr>
-          <w:rFonts w:ascii="游ゴシック" w:eastAsia="游ゴシック" w:hAnsi="游ゴシック" w:hint="eastAsia"/>
+          <w:rFonts w:ascii="Yu Gothic" w:eastAsia="Yu Gothic" w:hAnsi="Yu Gothic"/>
+          <w:sz w:val="21"/>
+          <w:szCs w:val="21"/>
+        </w:rPr>
+      </w:pPr>
+      <w:r>
+        <w:rPr>
+          <w:rFonts w:ascii="Yu Gothic" w:eastAsia="Yu Gothic" w:hAnsi="Yu Gothic" w:hint="eastAsia"/>
           <w:sz w:val="21"/>
           <w:szCs w:val="21"/>
         </w:rPr>
@@ -2345,20 +1797,14 @@
       <w:pPr>
         <w:pStyle w:val="2"/>
         <w:rPr>
-          <w:rFonts w:ascii="游ゴシック" w:eastAsia="游ゴシック" w:hAnsi="游ゴシック" w:hint="eastAsia"/>
-        </w:rPr>
-      </w:pPr>
-      <w:r>
-        <w:rPr>
-          <w:rFonts w:ascii="游ゴシック" w:eastAsia="游ゴシック" w:hAnsi="游ゴシック" w:hint="eastAsia"/>
-        </w:rPr>
-        <w:t xml:space="preserve">8. </w:t>
-      </w:r>
-      <w:r>
-        <w:rPr>
-          <w:rFonts w:ascii="游ゴシック" w:eastAsia="游ゴシック" w:hAnsi="游ゴシック" w:hint="eastAsia"/>
-        </w:rPr>
-        <w:t>確認事項</w:t>
+          <w:rFonts w:ascii="Yu Gothic" w:eastAsia="Yu Gothic" w:hAnsi="Yu Gothic"/>
+        </w:rPr>
+      </w:pPr>
+      <w:r>
+        <w:rPr>
+          <w:rFonts w:ascii="Yu Gothic" w:eastAsia="Yu Gothic" w:hAnsi="Yu Gothic" w:hint="eastAsia"/>
+        </w:rPr>
+        <w:t>8. 確認事項</w:t>
       </w:r>
     </w:p>
     <w:p>
@@ -2369,14 +1815,14 @@
         </w:numPr>
         <w:spacing w:after="40"/>
         <w:rPr>
-          <w:rFonts w:ascii="游ゴシック" w:eastAsia="游ゴシック" w:hAnsi="游ゴシック" w:hint="eastAsia"/>
-          <w:sz w:val="21"/>
-          <w:szCs w:val="21"/>
-        </w:rPr>
-      </w:pPr>
-      <w:r>
-        <w:rPr>
-          <w:rFonts w:ascii="游ゴシック" w:eastAsia="游ゴシック" w:hAnsi="游ゴシック" w:hint="eastAsia"/>
+          <w:rFonts w:ascii="Yu Gothic" w:eastAsia="Yu Gothic" w:hAnsi="Yu Gothic"/>
+          <w:sz w:val="21"/>
+          <w:szCs w:val="21"/>
+        </w:rPr>
+      </w:pPr>
+      <w:r>
+        <w:rPr>
+          <w:rFonts w:ascii="Yu Gothic" w:eastAsia="Yu Gothic" w:hAnsi="Yu Gothic" w:hint="eastAsia"/>
           <w:sz w:val="21"/>
           <w:szCs w:val="21"/>
         </w:rPr>
@@ -2391,14 +1837,14 @@
         </w:numPr>
         <w:spacing w:after="40"/>
         <w:rPr>
-          <w:rFonts w:ascii="游ゴシック" w:eastAsia="游ゴシック" w:hAnsi="游ゴシック" w:hint="eastAsia"/>
-          <w:sz w:val="21"/>
-          <w:szCs w:val="21"/>
-        </w:rPr>
-      </w:pPr>
-      <w:r>
-        <w:rPr>
-          <w:rFonts w:ascii="游ゴシック" w:eastAsia="游ゴシック" w:hAnsi="游ゴシック" w:hint="eastAsia"/>
+          <w:rFonts w:ascii="Yu Gothic" w:eastAsia="Yu Gothic" w:hAnsi="Yu Gothic"/>
+          <w:sz w:val="21"/>
+          <w:szCs w:val="21"/>
+        </w:rPr>
+      </w:pPr>
+      <w:r>
+        <w:rPr>
+          <w:rFonts w:ascii="Yu Gothic" w:eastAsia="Yu Gothic" w:hAnsi="Yu Gothic" w:hint="eastAsia"/>
           <w:sz w:val="21"/>
           <w:szCs w:val="21"/>
         </w:rPr>
@@ -2413,14 +1859,14 @@
         </w:numPr>
         <w:spacing w:after="40"/>
         <w:rPr>
-          <w:rFonts w:ascii="游ゴシック" w:eastAsia="游ゴシック" w:hAnsi="游ゴシック" w:hint="eastAsia"/>
-          <w:sz w:val="21"/>
-          <w:szCs w:val="21"/>
-        </w:rPr>
-      </w:pPr>
-      <w:r>
-        <w:rPr>
-          <w:rFonts w:ascii="游ゴシック" w:eastAsia="游ゴシック" w:hAnsi="游ゴシック" w:hint="eastAsia"/>
+          <w:rFonts w:ascii="Yu Gothic" w:eastAsia="Yu Gothic" w:hAnsi="Yu Gothic"/>
+          <w:sz w:val="21"/>
+          <w:szCs w:val="21"/>
+        </w:rPr>
+      </w:pPr>
+      <w:r>
+        <w:rPr>
+          <w:rFonts w:ascii="Yu Gothic" w:eastAsia="Yu Gothic" w:hAnsi="Yu Gothic" w:hint="eastAsia"/>
           <w:sz w:val="21"/>
           <w:szCs w:val="21"/>
         </w:rPr>
@@ -4049,8 +3495,8 @@
       <w:spacing w:after="80"/>
     </w:pPr>
   </w:style>
-  <w:style w:type="paragraph" w:customStyle="1" w:styleId="date">
-    <w:name w:val="date"/>
+  <w:style w:type="paragraph" w:customStyle="1" w:styleId="11">
+    <w:name w:val="日付1"/>
     <w:basedOn w:val="a"/>
     <w:pPr>
       <w:spacing w:after="40"/>
@@ -4062,8 +3508,8 @@
       <w:szCs w:val="19"/>
     </w:rPr>
   </w:style>
-  <w:style w:type="paragraph" w:customStyle="1" w:styleId="title">
-    <w:name w:val="title"/>
+  <w:style w:type="paragraph" w:customStyle="1" w:styleId="12">
+    <w:name w:val="表題1"/>
     <w:basedOn w:val="a"/>
     <w:pPr>
       <w:spacing w:before="80" w:after="80"/>

</xml_diff>